<commit_message>
Col·laboracions i enllaços corregits
</commit_message>
<xml_diff>
--- a/docs/fitxes.docx
+++ b/docs/fitxes.docx
@@ -522,6 +522,171 @@
           <w:rtl w:val="0"/>
         </w:rPr>
         <w:t xml:space="preserve">Prepara exemples reals o imaginaris que generin empatia amb el públic/jutges.</w:t>
+      </w:r>
+    </w:p>
+    <w:p>
+      <w:pPr>
+        <w:keepNext w:val="0"/>
+        <w:keepLines w:val="0"/>
+        <w:pageBreakBefore w:val="0"/>
+        <w:widowControl w:val="1"/>
+        <w:pBdr>
+          <w:top w:space="0" w:sz="0" w:val="nil"/>
+          <w:left w:space="0" w:sz="0" w:val="nil"/>
+          <w:bottom w:space="0" w:sz="0" w:val="nil"/>
+          <w:right w:space="0" w:sz="0" w:val="nil"/>
+          <w:between w:space="0" w:sz="0" w:val="nil"/>
+        </w:pBdr>
+        <w:shd w:fill="auto" w:val="clear"/>
+        <w:spacing w:after="0" w:before="40" w:line="240" w:lineRule="auto"/>
+        <w:ind w:left="0" w:right="0" w:firstLine="0"/>
+        <w:jc w:val="left"/>
+        <w:rPr/>
+      </w:pPr>
+      <w:r>
+        <w:rPr>
+          <w:rtl w:val="0"/>
+        </w:rPr>
+      </w:r>
+    </w:p>
+    <w:p>
+      <w:pPr>
+        <w:rPr/>
+      </w:pPr>
+      <w:r>
+        <w:pict>
+          <v:rect style="width:0.0pt;height:1.5pt" o:hr="t" o:hrstd="t" o:hralign="center" fillcolor="#A0A0A0" stroked="f"/>
+        </w:pict>
+      </w:r>
+      <w:r>
+        <w:rPr>
+          <w:rtl w:val="0"/>
+        </w:rPr>
+      </w:r>
+    </w:p>
+    <w:p>
+      <w:pPr>
+        <w:rPr/>
+      </w:pPr>
+      <w:r>
+        <w:rPr>
+          <w:rtl w:val="0"/>
+        </w:rPr>
+      </w:r>
+    </w:p>
+    <w:p>
+      <w:pPr>
+        <w:keepNext w:val="0"/>
+        <w:keepLines w:val="0"/>
+        <w:pageBreakBefore w:val="0"/>
+        <w:widowControl w:val="1"/>
+        <w:pBdr>
+          <w:top w:space="0" w:sz="0" w:val="nil"/>
+          <w:left w:space="0" w:sz="0" w:val="nil"/>
+          <w:bottom w:space="0" w:sz="0" w:val="nil"/>
+          <w:right w:space="0" w:sz="0" w:val="nil"/>
+          <w:between w:space="0" w:sz="0" w:val="nil"/>
+        </w:pBdr>
+        <w:shd w:fill="auto" w:val="clear"/>
+        <w:spacing w:after="0" w:before="40" w:line="240" w:lineRule="auto"/>
+        <w:ind w:left="0" w:right="0" w:firstLine="0"/>
+        <w:jc w:val="left"/>
+        <w:rPr>
+          <w:b w:val="1"/>
+        </w:rPr>
+      </w:pPr>
+      <w:r>
+        <w:rPr>
+          <w:b w:val="1"/>
+          <w:rtl w:val="0"/>
+        </w:rPr>
+        <w:t xml:space="preserve">Taula d’ajuda</w:t>
+      </w:r>
+    </w:p>
+    <w:p>
+      <w:pPr>
+        <w:keepNext w:val="0"/>
+        <w:keepLines w:val="0"/>
+        <w:pageBreakBefore w:val="0"/>
+        <w:widowControl w:val="1"/>
+        <w:pBdr>
+          <w:top w:space="0" w:sz="0" w:val="nil"/>
+          <w:left w:space="0" w:sz="0" w:val="nil"/>
+          <w:bottom w:space="0" w:sz="0" w:val="nil"/>
+          <w:right w:space="0" w:sz="0" w:val="nil"/>
+          <w:between w:space="0" w:sz="0" w:val="nil"/>
+        </w:pBdr>
+        <w:shd w:fill="auto" w:val="clear"/>
+        <w:spacing w:after="0" w:before="40" w:line="240" w:lineRule="auto"/>
+        <w:ind w:left="0" w:right="0" w:firstLine="0"/>
+        <w:jc w:val="left"/>
+        <w:rPr>
+          <w:b w:val="1"/>
+        </w:rPr>
+      </w:pPr>
+      <w:r>
+        <w:rPr>
+          <w:rtl w:val="0"/>
+        </w:rPr>
+      </w:r>
+    </w:p>
+    <w:p>
+      <w:pPr>
+        <w:keepNext w:val="0"/>
+        <w:keepLines w:val="0"/>
+        <w:pageBreakBefore w:val="0"/>
+        <w:widowControl w:val="1"/>
+        <w:pBdr>
+          <w:top w:space="0" w:sz="0" w:val="nil"/>
+          <w:left w:space="0" w:sz="0" w:val="nil"/>
+          <w:bottom w:space="0" w:sz="0" w:val="nil"/>
+          <w:right w:space="0" w:sz="0" w:val="nil"/>
+          <w:between w:space="0" w:sz="0" w:val="nil"/>
+        </w:pBdr>
+        <w:shd w:fill="auto" w:val="clear"/>
+        <w:spacing w:after="0" w:before="40" w:line="240" w:lineRule="auto"/>
+        <w:ind w:left="0" w:right="0" w:firstLine="0"/>
+        <w:jc w:val="left"/>
+        <w:rPr/>
+      </w:pPr>
+      <w:r>
+        <w:rPr>
+          <w:rtl w:val="0"/>
+        </w:rPr>
+        <w:t xml:space="preserve">Empleneu aquesta taula i penseu com reforçar els arguments que us </w:t>
+      </w:r>
+      <w:r>
+        <w:rPr>
+          <w:b w:val="1"/>
+          <w:color w:val="38761d"/>
+          <w:rtl w:val="0"/>
+        </w:rPr>
+        <w:t xml:space="preserve">beneficien </w:t>
+      </w:r>
+      <w:r>
+        <w:rPr>
+          <w:rtl w:val="0"/>
+        </w:rPr>
+        <w:t xml:space="preserve">i rebatre els arguments que us </w:t>
+      </w:r>
+      <w:r>
+        <w:rPr>
+          <w:b w:val="1"/>
+          <w:color w:val="980000"/>
+          <w:rtl w:val="0"/>
+        </w:rPr>
+        <w:t xml:space="preserve">perjudiquen</w:t>
+      </w:r>
+      <w:r>
+        <w:rPr>
+          <w:rtl w:val="0"/>
+        </w:rPr>
+        <w:t xml:space="preserve">.</w:t>
+      </w:r>
+      <w:r>
+        <w:rPr>
+          <w:rtl w:val="0"/>
+        </w:rPr>
         <w:br w:type="textWrapping"/>
       </w:r>
     </w:p>
@@ -549,130 +714,417 @@
           <w:rtl w:val="0"/>
         </w:rPr>
       </w:r>
-    </w:p>
-    <w:p>
-      <w:pPr>
-        <w:keepNext w:val="0"/>
-        <w:keepLines w:val="0"/>
-        <w:pageBreakBefore w:val="0"/>
-        <w:widowControl w:val="1"/>
-        <w:pBdr>
-          <w:top w:space="0" w:sz="0" w:val="nil"/>
-          <w:left w:space="0" w:sz="0" w:val="nil"/>
-          <w:bottom w:space="0" w:sz="0" w:val="nil"/>
-          <w:right w:space="0" w:sz="0" w:val="nil"/>
-          <w:between w:space="0" w:sz="0" w:val="nil"/>
-        </w:pBdr>
-        <w:shd w:fill="auto" w:val="clear"/>
-        <w:spacing w:after="0" w:before="40" w:line="240" w:lineRule="auto"/>
-        <w:ind w:right="0"/>
-        <w:jc w:val="left"/>
-        <w:rPr/>
-      </w:pPr>
-      <w:r>
-        <w:rPr>
-          <w:rtl w:val="0"/>
-        </w:rPr>
-      </w:r>
-    </w:p>
-    <w:p>
-      <w:pPr>
-        <w:keepNext w:val="0"/>
-        <w:keepLines w:val="0"/>
-        <w:pageBreakBefore w:val="0"/>
-        <w:widowControl w:val="1"/>
-        <w:pBdr>
-          <w:top w:space="0" w:sz="0" w:val="nil"/>
-          <w:left w:space="0" w:sz="0" w:val="nil"/>
-          <w:bottom w:space="0" w:sz="0" w:val="nil"/>
-          <w:right w:space="0" w:sz="0" w:val="nil"/>
-          <w:between w:space="0" w:sz="0" w:val="nil"/>
-        </w:pBdr>
-        <w:shd w:fill="auto" w:val="clear"/>
-        <w:spacing w:after="0" w:before="40" w:line="240" w:lineRule="auto"/>
-        <w:ind w:right="0"/>
-        <w:jc w:val="left"/>
-        <w:rPr/>
-      </w:pPr>
-      <w:r>
-        <w:rPr>
-          <w:rtl w:val="0"/>
-        </w:rPr>
-      </w:r>
-    </w:p>
-    <w:p>
-      <w:pPr>
-        <w:keepNext w:val="0"/>
-        <w:keepLines w:val="0"/>
-        <w:pageBreakBefore w:val="0"/>
-        <w:widowControl w:val="1"/>
-        <w:pBdr>
-          <w:top w:space="0" w:sz="0" w:val="nil"/>
-          <w:left w:space="0" w:sz="0" w:val="nil"/>
-          <w:bottom w:space="0" w:sz="0" w:val="nil"/>
-          <w:right w:space="0" w:sz="0" w:val="nil"/>
-          <w:between w:space="0" w:sz="0" w:val="nil"/>
-        </w:pBdr>
-        <w:shd w:fill="auto" w:val="clear"/>
-        <w:spacing w:after="0" w:before="40" w:line="240" w:lineRule="auto"/>
-        <w:ind w:right="0"/>
-        <w:jc w:val="left"/>
-        <w:rPr/>
-      </w:pPr>
-      <w:r>
-        <w:rPr>
-          <w:rtl w:val="0"/>
-        </w:rPr>
-      </w:r>
-    </w:p>
-    <w:p>
-      <w:pPr>
-        <w:keepNext w:val="0"/>
-        <w:keepLines w:val="0"/>
-        <w:pageBreakBefore w:val="0"/>
-        <w:widowControl w:val="1"/>
-        <w:pBdr>
-          <w:top w:space="0" w:sz="0" w:val="nil"/>
-          <w:left w:space="0" w:sz="0" w:val="nil"/>
-          <w:bottom w:space="0" w:sz="0" w:val="nil"/>
-          <w:right w:space="0" w:sz="0" w:val="nil"/>
-          <w:between w:space="0" w:sz="0" w:val="nil"/>
-        </w:pBdr>
-        <w:shd w:fill="auto" w:val="clear"/>
-        <w:spacing w:after="0" w:before="40" w:line="240" w:lineRule="auto"/>
-        <w:ind w:right="0"/>
-        <w:jc w:val="left"/>
-        <w:rPr/>
-      </w:pPr>
-      <w:r>
-        <w:rPr>
-          <w:rtl w:val="0"/>
-        </w:rPr>
-      </w:r>
-    </w:p>
-    <w:p>
-      <w:pPr>
-        <w:keepNext w:val="0"/>
-        <w:keepLines w:val="0"/>
-        <w:pageBreakBefore w:val="0"/>
-        <w:widowControl w:val="1"/>
-        <w:pBdr>
-          <w:top w:space="0" w:sz="0" w:val="nil"/>
-          <w:left w:space="0" w:sz="0" w:val="nil"/>
-          <w:bottom w:space="0" w:sz="0" w:val="nil"/>
-          <w:right w:space="0" w:sz="0" w:val="nil"/>
-          <w:between w:space="0" w:sz="0" w:val="nil"/>
-        </w:pBdr>
-        <w:shd w:fill="auto" w:val="clear"/>
-        <w:spacing w:after="0" w:before="40" w:line="240" w:lineRule="auto"/>
-        <w:ind w:right="0"/>
-        <w:jc w:val="left"/>
-        <w:rPr/>
-      </w:pPr>
-      <w:r>
-        <w:rPr>
-          <w:rtl w:val="0"/>
-        </w:rPr>
+      <w:r>
+        <mc:AlternateContent>
+          <mc:Choice Requires="wpg">
+            <w:drawing>
+              <wp:anchor allowOverlap="1" behindDoc="0" distB="114300" distT="114300" distL="114300" distR="114300" hidden="0" layoutInCell="1" locked="0" relativeHeight="0" simplePos="0">
+                <wp:simplePos x="0" y="0"/>
+                <wp:positionH relativeFrom="column">
+                  <wp:posOffset>114300</wp:posOffset>
+                </wp:positionH>
+                <wp:positionV relativeFrom="paragraph">
+                  <wp:posOffset>139700</wp:posOffset>
+                </wp:positionV>
+                <wp:extent cx="5157788" cy="4521437"/>
+                <wp:effectExtent b="0" l="0" r="0" t="0"/>
+                <wp:wrapSquare wrapText="bothSides" distB="114300" distT="114300" distL="114300" distR="114300"/>
+                <wp:docPr id="1" name=""/>
+                <a:graphic>
+                  <a:graphicData uri="http://schemas.microsoft.com/office/word/2010/wordprocessingGroup">
+                    <wpg:wgp>
+                      <wpg:cNvGrpSpPr/>
+                      <wpg:grpSpPr>
+                        <a:xfrm>
+                          <a:off x="292450" y="580575"/>
+                          <a:ext cx="5157788" cy="4521437"/>
+                          <a:chOff x="292450" y="580575"/>
+                          <a:chExt cx="5852825" cy="5134425"/>
+                        </a:xfrm>
+                      </wpg:grpSpPr>
+                      <wps:wsp>
+                        <wps:cNvCnPr/>
+                        <wps:spPr>
+                          <a:xfrm>
+                            <a:off x="3117662" y="580625"/>
+                            <a:ext cx="18900" cy="5450400"/>
+                          </a:xfrm>
+                          <a:prstGeom prst="straightConnector1">
+                            <a:avLst/>
+                          </a:prstGeom>
+                          <a:noFill/>
+                          <a:ln cap="flat" cmpd="sng" w="19050">
+                            <a:solidFill>
+                              <a:srgbClr val="000000"/>
+                            </a:solidFill>
+                            <a:prstDash val="solid"/>
+                            <a:round/>
+                            <a:headEnd len="med" w="med" type="none"/>
+                            <a:tailEnd len="med" w="med" type="none"/>
+                          </a:ln>
+                        </wps:spPr>
+                        <wps:bodyPr anchorCtr="0" anchor="ctr" bIns="168125" lIns="168125" spcFirstLastPara="1" rIns="168125" wrap="square" tIns="168125">
+                          <a:noAutofit/>
+                        </wps:bodyPr>
+                      </wps:wsp>
+                      <wps:wsp>
+                        <wps:cNvSpPr txBox="1"/>
+                        <wps:cNvPr id="3" name="Shape 3"/>
+                        <wps:spPr>
+                          <a:xfrm>
+                            <a:off x="292475" y="746775"/>
+                            <a:ext cx="3008700" cy="790500"/>
+                          </a:xfrm>
+                          <a:prstGeom prst="rect">
+                            <a:avLst/>
+                          </a:prstGeom>
+                          <a:noFill/>
+                          <a:ln>
+                            <a:noFill/>
+                          </a:ln>
+                        </wps:spPr>
+                        <wps:txbx>
+                          <w:txbxContent>
+                            <w:p>
+                              <w:pPr>
+                                <w:spacing w:after="0" w:before="0" w:line="240"/>
+                                <w:ind w:left="0" w:right="0" w:firstLine="0"/>
+                                <w:jc w:val="center"/>
+                                <w:textDirection w:val="btLr"/>
+                              </w:pPr>
+                              <w:r>
+                                <w:rPr>
+                                  <w:rFonts w:ascii="Montserrat" w:cs="Montserrat" w:eastAsia="Montserrat" w:hAnsi="Montserrat"/>
+                                  <w:b w:val="0"/>
+                                  <w:i w:val="0"/>
+                                  <w:smallCaps w:val="0"/>
+                                  <w:strike w:val="0"/>
+                                  <w:color w:val="000000"/>
+                                  <w:sz w:val="20"/>
+                                  <w:vertAlign w:val="baseline"/>
+                                </w:rPr>
+                                <w:t xml:space="preserve">Punts </w:t>
+                              </w:r>
+                              <w:r>
+                                <w:rPr>
+                                  <w:rFonts w:ascii="Montserrat" w:cs="Montserrat" w:eastAsia="Montserrat" w:hAnsi="Montserrat"/>
+                                  <w:b w:val="1"/>
+                                  <w:i w:val="0"/>
+                                  <w:smallCaps w:val="0"/>
+                                  <w:strike w:val="0"/>
+                                  <w:color w:val="38761d"/>
+                                  <w:sz w:val="20"/>
+                                  <w:vertAlign w:val="baseline"/>
+                                </w:rPr>
+                                <w:t xml:space="preserve">a favor</w:t>
+                              </w:r>
+                              <w:r>
+                                <w:rPr>
+                                  <w:rFonts w:ascii="Montserrat" w:cs="Montserrat" w:eastAsia="Montserrat" w:hAnsi="Montserrat"/>
+                                  <w:b w:val="0"/>
+                                  <w:i w:val="0"/>
+                                  <w:smallCaps w:val="0"/>
+                                  <w:strike w:val="0"/>
+                                  <w:color w:val="000000"/>
+                                  <w:sz w:val="20"/>
+                                  <w:vertAlign w:val="baseline"/>
+                                </w:rPr>
+                                <w:t xml:space="preserve"> del nostre punt de vista</w:t>
+                              </w:r>
+                            </w:p>
+                          </w:txbxContent>
+                        </wps:txbx>
+                        <wps:bodyPr anchorCtr="0" anchor="t" bIns="168125" lIns="168125" spcFirstLastPara="1" rIns="168125" wrap="square" tIns="168125">
+                          <a:noAutofit/>
+                        </wps:bodyPr>
+                      </wps:wsp>
+                      <wps:wsp>
+                        <wps:cNvSpPr txBox="1"/>
+                        <wps:cNvPr id="4" name="Shape 4"/>
+                        <wps:spPr>
+                          <a:xfrm>
+                            <a:off x="3136553" y="746776"/>
+                            <a:ext cx="3008700" cy="790500"/>
+                          </a:xfrm>
+                          <a:prstGeom prst="rect">
+                            <a:avLst/>
+                          </a:prstGeom>
+                          <a:noFill/>
+                          <a:ln>
+                            <a:noFill/>
+                          </a:ln>
+                        </wps:spPr>
+                        <wps:txbx>
+                          <w:txbxContent>
+                            <w:p>
+                              <w:pPr>
+                                <w:spacing w:after="0" w:before="0" w:line="240"/>
+                                <w:ind w:left="0" w:right="0" w:firstLine="0"/>
+                                <w:jc w:val="center"/>
+                                <w:textDirection w:val="btLr"/>
+                              </w:pPr>
+                              <w:r>
+                                <w:rPr>
+                                  <w:rFonts w:ascii="Montserrat" w:cs="Montserrat" w:eastAsia="Montserrat" w:hAnsi="Montserrat"/>
+                                  <w:b w:val="0"/>
+                                  <w:i w:val="0"/>
+                                  <w:smallCaps w:val="0"/>
+                                  <w:strike w:val="0"/>
+                                  <w:color w:val="000000"/>
+                                  <w:sz w:val="20"/>
+                                  <w:vertAlign w:val="baseline"/>
+                                </w:rPr>
+                                <w:t xml:space="preserve">Punts </w:t>
+                              </w:r>
+                              <w:r>
+                                <w:rPr>
+                                  <w:rFonts w:ascii="Montserrat" w:cs="Montserrat" w:eastAsia="Montserrat" w:hAnsi="Montserrat"/>
+                                  <w:b w:val="1"/>
+                                  <w:i w:val="0"/>
+                                  <w:smallCaps w:val="0"/>
+                                  <w:strike w:val="0"/>
+                                  <w:color w:val="980000"/>
+                                  <w:sz w:val="20"/>
+                                  <w:vertAlign w:val="baseline"/>
+                                </w:rPr>
+                                <w:t xml:space="preserve">en contra </w:t>
+                              </w:r>
+                              <w:r>
+                                <w:rPr>
+                                  <w:rFonts w:ascii="Montserrat" w:cs="Montserrat" w:eastAsia="Montserrat" w:hAnsi="Montserrat"/>
+                                  <w:b w:val="0"/>
+                                  <w:i w:val="0"/>
+                                  <w:smallCaps w:val="0"/>
+                                  <w:strike w:val="0"/>
+                                  <w:color w:val="000000"/>
+                                  <w:sz w:val="20"/>
+                                  <w:vertAlign w:val="baseline"/>
+                                </w:rPr>
+                                <w:t xml:space="preserve">del nostre punt de vista</w:t>
+                              </w:r>
+                            </w:p>
+                          </w:txbxContent>
+                        </wps:txbx>
+                        <wps:bodyPr anchorCtr="0" anchor="t" bIns="168125" lIns="168125" spcFirstLastPara="1" rIns="168125" wrap="square" tIns="168125">
+                          <a:noAutofit/>
+                        </wps:bodyPr>
+                      </wps:wsp>
+                      <wps:wsp>
+                        <wps:cNvSpPr txBox="1"/>
+                        <wps:cNvPr id="5" name="Shape 5"/>
+                        <wps:spPr>
+                          <a:xfrm>
+                            <a:off x="369301" y="3569050"/>
+                            <a:ext cx="2748000" cy="790500"/>
+                          </a:xfrm>
+                          <a:prstGeom prst="rect">
+                            <a:avLst/>
+                          </a:prstGeom>
+                          <a:noFill/>
+                          <a:ln>
+                            <a:noFill/>
+                          </a:ln>
+                        </wps:spPr>
+                        <wps:txbx>
+                          <w:txbxContent>
+                            <w:p>
+                              <w:pPr>
+                                <w:spacing w:after="0" w:before="0" w:line="240"/>
+                                <w:ind w:left="0" w:right="0" w:firstLine="0"/>
+                                <w:jc w:val="center"/>
+                                <w:textDirection w:val="btLr"/>
+                              </w:pPr>
+                              <w:r>
+                                <w:rPr>
+                                  <w:rFonts w:ascii="Montserrat" w:cs="Montserrat" w:eastAsia="Montserrat" w:hAnsi="Montserrat"/>
+                                  <w:b w:val="0"/>
+                                  <w:i w:val="0"/>
+                                  <w:smallCaps w:val="0"/>
+                                  <w:strike w:val="0"/>
+                                  <w:color w:val="000000"/>
+                                  <w:sz w:val="20"/>
+                                  <w:vertAlign w:val="baseline"/>
+                                </w:rPr>
+                                <w:t xml:space="preserve">Punts </w:t>
+                              </w:r>
+                              <w:r>
+                                <w:rPr>
+                                  <w:rFonts w:ascii="Montserrat" w:cs="Montserrat" w:eastAsia="Montserrat" w:hAnsi="Montserrat"/>
+                                  <w:b w:val="1"/>
+                                  <w:i w:val="0"/>
+                                  <w:smallCaps w:val="0"/>
+                                  <w:strike w:val="0"/>
+                                  <w:color w:val="980000"/>
+                                  <w:sz w:val="20"/>
+                                  <w:vertAlign w:val="baseline"/>
+                                </w:rPr>
+                                <w:t xml:space="preserve">a favor de l’altre </w:t>
+                              </w:r>
+                              <w:r>
+                                <w:rPr>
+                                  <w:rFonts w:ascii="Montserrat" w:cs="Montserrat" w:eastAsia="Montserrat" w:hAnsi="Montserrat"/>
+                                  <w:b w:val="0"/>
+                                  <w:i w:val="0"/>
+                                  <w:smallCaps w:val="0"/>
+                                  <w:strike w:val="0"/>
+                                  <w:color w:val="000000"/>
+                                  <w:sz w:val="20"/>
+                                  <w:vertAlign w:val="baseline"/>
+                                </w:rPr>
+                                <w:t xml:space="preserve">punt de vista</w:t>
+                              </w:r>
+                            </w:p>
+                          </w:txbxContent>
+                        </wps:txbx>
+                        <wps:bodyPr anchorCtr="0" anchor="t" bIns="168125" lIns="168125" spcFirstLastPara="1" rIns="168125" wrap="square" tIns="168125">
+                          <a:noAutofit/>
+                        </wps:bodyPr>
+                      </wps:wsp>
+                      <wps:wsp>
+                        <wps:cNvSpPr txBox="1"/>
+                        <wps:cNvPr id="6" name="Shape 6"/>
+                        <wps:spPr>
+                          <a:xfrm>
+                            <a:off x="3117649" y="3569050"/>
+                            <a:ext cx="2941800" cy="790500"/>
+                          </a:xfrm>
+                          <a:prstGeom prst="rect">
+                            <a:avLst/>
+                          </a:prstGeom>
+                          <a:noFill/>
+                          <a:ln>
+                            <a:noFill/>
+                          </a:ln>
+                        </wps:spPr>
+                        <wps:txbx>
+                          <w:txbxContent>
+                            <w:p>
+                              <w:pPr>
+                                <w:spacing w:after="0" w:before="0" w:line="240"/>
+                                <w:ind w:left="0" w:right="0" w:firstLine="0"/>
+                                <w:jc w:val="center"/>
+                                <w:textDirection w:val="btLr"/>
+                              </w:pPr>
+                              <w:r>
+                                <w:rPr>
+                                  <w:rFonts w:ascii="Montserrat" w:cs="Montserrat" w:eastAsia="Montserrat" w:hAnsi="Montserrat"/>
+                                  <w:b w:val="0"/>
+                                  <w:i w:val="0"/>
+                                  <w:smallCaps w:val="0"/>
+                                  <w:strike w:val="0"/>
+                                  <w:color w:val="000000"/>
+                                  <w:sz w:val="20"/>
+                                  <w:vertAlign w:val="baseline"/>
+                                </w:rPr>
+                                <w:t xml:space="preserve">Punts </w:t>
+                              </w:r>
+                              <w:r>
+                                <w:rPr>
+                                  <w:rFonts w:ascii="Montserrat" w:cs="Montserrat" w:eastAsia="Montserrat" w:hAnsi="Montserrat"/>
+                                  <w:b w:val="1"/>
+                                  <w:i w:val="0"/>
+                                  <w:smallCaps w:val="0"/>
+                                  <w:strike w:val="0"/>
+                                  <w:color w:val="38761d"/>
+                                  <w:sz w:val="20"/>
+                                  <w:vertAlign w:val="baseline"/>
+                                </w:rPr>
+                                <w:t xml:space="preserve">en contra de l’altre</w:t>
+                              </w:r>
+                              <w:r>
+                                <w:rPr>
+                                  <w:rFonts w:ascii="Montserrat" w:cs="Montserrat" w:eastAsia="Montserrat" w:hAnsi="Montserrat"/>
+                                  <w:b w:val="0"/>
+                                  <w:i w:val="0"/>
+                                  <w:smallCaps w:val="0"/>
+                                  <w:strike w:val="0"/>
+                                  <w:color w:val="000000"/>
+                                  <w:sz w:val="20"/>
+                                  <w:vertAlign w:val="baseline"/>
+                                </w:rPr>
+                                <w:t xml:space="preserve"> punt de vista</w:t>
+                              </w:r>
+                            </w:p>
+                          </w:txbxContent>
+                        </wps:txbx>
+                        <wps:bodyPr anchorCtr="0" anchor="t" bIns="168125" lIns="168125" spcFirstLastPara="1" rIns="168125" wrap="square" tIns="168125">
+                          <a:noAutofit/>
+                        </wps:bodyPr>
+                      </wps:wsp>
+                      <wps:wsp>
+                        <wps:cNvCnPr/>
+                        <wps:spPr>
+                          <a:xfrm flipH="1" rot="10800000">
+                            <a:off x="319175" y="3347025"/>
+                            <a:ext cx="5706600" cy="16800"/>
+                          </a:xfrm>
+                          <a:prstGeom prst="straightConnector1">
+                            <a:avLst/>
+                          </a:prstGeom>
+                          <a:noFill/>
+                          <a:ln cap="flat" cmpd="sng" w="19050">
+                            <a:solidFill>
+                              <a:srgbClr val="000000"/>
+                            </a:solidFill>
+                            <a:prstDash val="solid"/>
+                            <a:round/>
+                            <a:headEnd len="med" w="med" type="none"/>
+                            <a:tailEnd len="med" w="med" type="none"/>
+                          </a:ln>
+                        </wps:spPr>
+                        <wps:bodyPr anchorCtr="0" anchor="ctr" bIns="91425" lIns="91425" spcFirstLastPara="1" rIns="91425" wrap="square" tIns="91425">
+                          <a:noAutofit/>
+                        </wps:bodyPr>
+                      </wps:wsp>
+                    </wpg:wgp>
+                  </a:graphicData>
+                </a:graphic>
+              </wp:anchor>
+            </w:drawing>
+          </mc:Choice>
+          <mc:Fallback>
+            <w:drawing>
+              <wp:anchor allowOverlap="1" behindDoc="0" distB="114300" distT="114300" distL="114300" distR="114300" hidden="0" layoutInCell="1" locked="0" relativeHeight="0" simplePos="0">
+                <wp:simplePos x="0" y="0"/>
+                <wp:positionH relativeFrom="column">
+                  <wp:posOffset>114300</wp:posOffset>
+                </wp:positionH>
+                <wp:positionV relativeFrom="paragraph">
+                  <wp:posOffset>139700</wp:posOffset>
+                </wp:positionV>
+                <wp:extent cx="5157788" cy="4521437"/>
+                <wp:effectExtent b="0" l="0" r="0" t="0"/>
+                <wp:wrapSquare wrapText="bothSides" distB="114300" distT="114300" distL="114300" distR="114300"/>
+                <wp:docPr id="1" name="image1.png"/>
+                <a:graphic>
+                  <a:graphicData uri="http://schemas.openxmlformats.org/drawingml/2006/picture">
+                    <pic:pic>
+                      <pic:nvPicPr>
+                        <pic:cNvPr id="0" name="image1.png"/>
+                        <pic:cNvPicPr preferRelativeResize="0"/>
+                      </pic:nvPicPr>
+                      <pic:blipFill>
+                        <a:blip r:embed="rId6"/>
+                        <a:srcRect/>
+                        <a:stretch>
+                          <a:fillRect/>
+                        </a:stretch>
+                      </pic:blipFill>
+                      <pic:spPr>
+                        <a:xfrm>
+                          <a:off x="0" y="0"/>
+                          <a:ext cx="5157788" cy="4521437"/>
+                        </a:xfrm>
+                        <a:prstGeom prst="rect"/>
+                        <a:ln/>
+                      </pic:spPr>
+                    </pic:pic>
+                  </a:graphicData>
+                </a:graphic>
+              </wp:anchor>
+            </w:drawing>
+          </mc:Fallback>
+        </mc:AlternateContent>
       </w:r>
     </w:p>
     <w:p>
@@ -1982,282 +2434,564 @@
           <w:rtl w:val="0"/>
         </w:rPr>
         <w:t xml:space="preserve">Posa exemples on la innovació ha començat com a elitista i després s’ha democratitzat (GPS, mòbils, internet...).</w:t>
-        <w:br w:type="textWrapping"/>
-      </w:r>
-    </w:p>
-    <w:p>
-      <w:pPr>
-        <w:keepNext w:val="0"/>
-        <w:keepLines w:val="0"/>
-        <w:pageBreakBefore w:val="0"/>
-        <w:widowControl w:val="1"/>
-        <w:pBdr>
-          <w:top w:space="0" w:sz="0" w:val="nil"/>
-          <w:left w:space="0" w:sz="0" w:val="nil"/>
-          <w:bottom w:space="0" w:sz="0" w:val="nil"/>
-          <w:right w:space="0" w:sz="0" w:val="nil"/>
-          <w:between w:space="0" w:sz="0" w:val="nil"/>
-        </w:pBdr>
-        <w:shd w:fill="auto" w:val="clear"/>
-        <w:spacing w:after="0" w:before="40" w:line="240" w:lineRule="auto"/>
-        <w:ind w:right="0"/>
-        <w:jc w:val="left"/>
-        <w:rPr/>
-      </w:pPr>
-      <w:r>
-        <w:rPr>
-          <w:rtl w:val="0"/>
-        </w:rPr>
-      </w:r>
-    </w:p>
-    <w:p>
-      <w:pPr>
-        <w:keepNext w:val="0"/>
-        <w:keepLines w:val="0"/>
-        <w:pageBreakBefore w:val="0"/>
-        <w:widowControl w:val="1"/>
-        <w:pBdr>
-          <w:top w:space="0" w:sz="0" w:val="nil"/>
-          <w:left w:space="0" w:sz="0" w:val="nil"/>
-          <w:bottom w:space="0" w:sz="0" w:val="nil"/>
-          <w:right w:space="0" w:sz="0" w:val="nil"/>
-          <w:between w:space="0" w:sz="0" w:val="nil"/>
-        </w:pBdr>
-        <w:shd w:fill="auto" w:val="clear"/>
-        <w:spacing w:after="0" w:before="40" w:line="240" w:lineRule="auto"/>
-        <w:ind w:right="0"/>
-        <w:jc w:val="left"/>
-        <w:rPr/>
-      </w:pPr>
-      <w:r>
-        <w:rPr>
-          <w:rtl w:val="0"/>
-        </w:rPr>
-      </w:r>
-    </w:p>
-    <w:p>
-      <w:pPr>
-        <w:keepNext w:val="0"/>
-        <w:keepLines w:val="0"/>
-        <w:pageBreakBefore w:val="0"/>
-        <w:widowControl w:val="1"/>
-        <w:pBdr>
-          <w:top w:space="0" w:sz="0" w:val="nil"/>
-          <w:left w:space="0" w:sz="0" w:val="nil"/>
-          <w:bottom w:space="0" w:sz="0" w:val="nil"/>
-          <w:right w:space="0" w:sz="0" w:val="nil"/>
-          <w:between w:space="0" w:sz="0" w:val="nil"/>
-        </w:pBdr>
-        <w:shd w:fill="auto" w:val="clear"/>
-        <w:spacing w:after="0" w:before="40" w:line="240" w:lineRule="auto"/>
-        <w:ind w:right="0"/>
-        <w:jc w:val="left"/>
-        <w:rPr/>
-      </w:pPr>
-      <w:r>
-        <w:rPr>
-          <w:rtl w:val="0"/>
-        </w:rPr>
-      </w:r>
-    </w:p>
-    <w:p>
-      <w:pPr>
-        <w:keepNext w:val="0"/>
-        <w:keepLines w:val="0"/>
-        <w:pageBreakBefore w:val="0"/>
-        <w:widowControl w:val="1"/>
-        <w:pBdr>
-          <w:top w:space="0" w:sz="0" w:val="nil"/>
-          <w:left w:space="0" w:sz="0" w:val="nil"/>
-          <w:bottom w:space="0" w:sz="0" w:val="nil"/>
-          <w:right w:space="0" w:sz="0" w:val="nil"/>
-          <w:between w:space="0" w:sz="0" w:val="nil"/>
-        </w:pBdr>
-        <w:shd w:fill="auto" w:val="clear"/>
-        <w:spacing w:after="0" w:before="40" w:line="240" w:lineRule="auto"/>
-        <w:ind w:right="0"/>
-        <w:jc w:val="left"/>
-        <w:rPr/>
-      </w:pPr>
-      <w:r>
-        <w:rPr>
-          <w:rtl w:val="0"/>
-        </w:rPr>
-      </w:r>
-    </w:p>
-    <w:p>
-      <w:pPr>
-        <w:keepNext w:val="0"/>
-        <w:keepLines w:val="0"/>
-        <w:pageBreakBefore w:val="0"/>
-        <w:widowControl w:val="1"/>
-        <w:pBdr>
-          <w:top w:space="0" w:sz="0" w:val="nil"/>
-          <w:left w:space="0" w:sz="0" w:val="nil"/>
-          <w:bottom w:space="0" w:sz="0" w:val="nil"/>
-          <w:right w:space="0" w:sz="0" w:val="nil"/>
-          <w:between w:space="0" w:sz="0" w:val="nil"/>
-        </w:pBdr>
-        <w:shd w:fill="auto" w:val="clear"/>
-        <w:spacing w:after="0" w:before="40" w:line="240" w:lineRule="auto"/>
-        <w:ind w:right="0"/>
-        <w:jc w:val="left"/>
-        <w:rPr/>
-      </w:pPr>
-      <w:r>
-        <w:rPr>
-          <w:rtl w:val="0"/>
-        </w:rPr>
-      </w:r>
-    </w:p>
-    <w:p>
-      <w:pPr>
-        <w:keepNext w:val="0"/>
-        <w:keepLines w:val="0"/>
-        <w:pageBreakBefore w:val="0"/>
-        <w:widowControl w:val="1"/>
-        <w:pBdr>
-          <w:top w:space="0" w:sz="0" w:val="nil"/>
-          <w:left w:space="0" w:sz="0" w:val="nil"/>
-          <w:bottom w:space="0" w:sz="0" w:val="nil"/>
-          <w:right w:space="0" w:sz="0" w:val="nil"/>
-          <w:between w:space="0" w:sz="0" w:val="nil"/>
-        </w:pBdr>
-        <w:shd w:fill="auto" w:val="clear"/>
-        <w:spacing w:after="0" w:before="40" w:line="240" w:lineRule="auto"/>
-        <w:ind w:right="0"/>
-        <w:jc w:val="left"/>
-        <w:rPr/>
-      </w:pPr>
-      <w:r>
-        <w:rPr>
-          <w:rtl w:val="0"/>
-        </w:rPr>
-      </w:r>
-    </w:p>
-    <w:p>
-      <w:pPr>
-        <w:keepNext w:val="0"/>
-        <w:keepLines w:val="0"/>
-        <w:pageBreakBefore w:val="0"/>
-        <w:widowControl w:val="1"/>
-        <w:pBdr>
-          <w:top w:space="0" w:sz="0" w:val="nil"/>
-          <w:left w:space="0" w:sz="0" w:val="nil"/>
-          <w:bottom w:space="0" w:sz="0" w:val="nil"/>
-          <w:right w:space="0" w:sz="0" w:val="nil"/>
-          <w:between w:space="0" w:sz="0" w:val="nil"/>
-        </w:pBdr>
-        <w:shd w:fill="auto" w:val="clear"/>
-        <w:spacing w:after="0" w:before="40" w:line="240" w:lineRule="auto"/>
-        <w:ind w:right="0"/>
-        <w:jc w:val="left"/>
-        <w:rPr/>
-      </w:pPr>
-      <w:r>
-        <w:rPr>
-          <w:rtl w:val="0"/>
-        </w:rPr>
-      </w:r>
-    </w:p>
-    <w:p>
-      <w:pPr>
-        <w:keepNext w:val="0"/>
-        <w:keepLines w:val="0"/>
-        <w:pageBreakBefore w:val="0"/>
-        <w:widowControl w:val="1"/>
-        <w:pBdr>
-          <w:top w:space="0" w:sz="0" w:val="nil"/>
-          <w:left w:space="0" w:sz="0" w:val="nil"/>
-          <w:bottom w:space="0" w:sz="0" w:val="nil"/>
-          <w:right w:space="0" w:sz="0" w:val="nil"/>
-          <w:between w:space="0" w:sz="0" w:val="nil"/>
-        </w:pBdr>
-        <w:shd w:fill="auto" w:val="clear"/>
-        <w:spacing w:after="0" w:before="40" w:line="240" w:lineRule="auto"/>
-        <w:ind w:right="0"/>
-        <w:jc w:val="left"/>
-        <w:rPr/>
-      </w:pPr>
-      <w:r>
-        <w:rPr>
-          <w:rtl w:val="0"/>
-        </w:rPr>
-      </w:r>
-    </w:p>
-    <w:p>
-      <w:pPr>
-        <w:keepNext w:val="0"/>
-        <w:keepLines w:val="0"/>
-        <w:pageBreakBefore w:val="0"/>
-        <w:widowControl w:val="1"/>
-        <w:pBdr>
-          <w:top w:space="0" w:sz="0" w:val="nil"/>
-          <w:left w:space="0" w:sz="0" w:val="nil"/>
-          <w:bottom w:space="0" w:sz="0" w:val="nil"/>
-          <w:right w:space="0" w:sz="0" w:val="nil"/>
-          <w:between w:space="0" w:sz="0" w:val="nil"/>
-        </w:pBdr>
-        <w:shd w:fill="auto" w:val="clear"/>
-        <w:spacing w:after="0" w:before="40" w:line="240" w:lineRule="auto"/>
-        <w:ind w:right="0"/>
-        <w:jc w:val="left"/>
-        <w:rPr/>
-      </w:pPr>
-      <w:r>
-        <w:rPr>
-          <w:rtl w:val="0"/>
-        </w:rPr>
-      </w:r>
-    </w:p>
-    <w:p>
-      <w:pPr>
-        <w:keepNext w:val="0"/>
-        <w:keepLines w:val="0"/>
-        <w:pageBreakBefore w:val="0"/>
-        <w:widowControl w:val="1"/>
-        <w:pBdr>
-          <w:top w:space="0" w:sz="0" w:val="nil"/>
-          <w:left w:space="0" w:sz="0" w:val="nil"/>
-          <w:bottom w:space="0" w:sz="0" w:val="nil"/>
-          <w:right w:space="0" w:sz="0" w:val="nil"/>
-          <w:between w:space="0" w:sz="0" w:val="nil"/>
-        </w:pBdr>
-        <w:shd w:fill="auto" w:val="clear"/>
-        <w:spacing w:after="0" w:before="40" w:line="240" w:lineRule="auto"/>
-        <w:ind w:right="0"/>
-        <w:jc w:val="left"/>
-        <w:rPr/>
-      </w:pPr>
-      <w:r>
-        <w:rPr>
-          <w:rtl w:val="0"/>
-        </w:rPr>
-      </w:r>
-    </w:p>
-    <w:p>
-      <w:pPr>
-        <w:keepNext w:val="0"/>
-        <w:keepLines w:val="0"/>
-        <w:pageBreakBefore w:val="0"/>
-        <w:widowControl w:val="1"/>
-        <w:pBdr>
-          <w:top w:space="0" w:sz="0" w:val="nil"/>
-          <w:left w:space="0" w:sz="0" w:val="nil"/>
-          <w:bottom w:space="0" w:sz="0" w:val="nil"/>
-          <w:right w:space="0" w:sz="0" w:val="nil"/>
-          <w:between w:space="0" w:sz="0" w:val="nil"/>
-        </w:pBdr>
-        <w:shd w:fill="auto" w:val="clear"/>
-        <w:spacing w:after="0" w:before="40" w:line="240" w:lineRule="auto"/>
-        <w:ind w:right="0"/>
-        <w:jc w:val="left"/>
-        <w:rPr/>
-      </w:pPr>
-      <w:r>
-        <w:rPr>
-          <w:rtl w:val="0"/>
-        </w:rPr>
+      </w:r>
+    </w:p>
+    <w:p>
+      <w:pPr>
+        <w:rPr/>
+      </w:pPr>
+      <w:r>
+        <w:pict>
+          <v:rect style="width:0.0pt;height:1.5pt" o:hr="t" o:hrstd="t" o:hralign="center" fillcolor="#A0A0A0" stroked="f"/>
+        </w:pict>
+      </w:r>
+      <w:r>
+        <w:rPr>
+          <w:rtl w:val="0"/>
+        </w:rPr>
+      </w:r>
+    </w:p>
+    <w:p>
+      <w:pPr>
+        <w:rPr/>
+      </w:pPr>
+      <w:r>
+        <w:rPr>
+          <w:rtl w:val="0"/>
+        </w:rPr>
+      </w:r>
+    </w:p>
+    <w:p>
+      <w:pPr>
+        <w:spacing w:before="40" w:line="240" w:lineRule="auto"/>
+        <w:jc w:val="left"/>
+        <w:rPr>
+          <w:b w:val="1"/>
+        </w:rPr>
+      </w:pPr>
+      <w:r>
+        <w:rPr>
+          <w:b w:val="1"/>
+          <w:rtl w:val="0"/>
+        </w:rPr>
+        <w:t xml:space="preserve">Taula d’ajuda</w:t>
+      </w:r>
+    </w:p>
+    <w:p>
+      <w:pPr>
+        <w:spacing w:before="40" w:line="240" w:lineRule="auto"/>
+        <w:jc w:val="left"/>
+        <w:rPr>
+          <w:b w:val="1"/>
+        </w:rPr>
+      </w:pPr>
+      <w:r>
+        <w:rPr>
+          <w:rtl w:val="0"/>
+        </w:rPr>
+      </w:r>
+    </w:p>
+    <w:p>
+      <w:pPr>
+        <w:spacing w:before="40" w:line="240" w:lineRule="auto"/>
+        <w:jc w:val="left"/>
+        <w:rPr/>
+      </w:pPr>
+      <w:r>
+        <w:rPr>
+          <w:rtl w:val="0"/>
+        </w:rPr>
+        <w:t xml:space="preserve">Empleneu aquesta taula i penseu com reforçar els arguments que us </w:t>
+      </w:r>
+      <w:r>
+        <w:rPr>
+          <w:b w:val="1"/>
+          <w:color w:val="38761d"/>
+          <w:rtl w:val="0"/>
+        </w:rPr>
+        <w:t xml:space="preserve">beneficien </w:t>
+      </w:r>
+      <w:r>
+        <w:rPr>
+          <w:rtl w:val="0"/>
+        </w:rPr>
+        <w:t xml:space="preserve">i rebatre els arguments que us </w:t>
+      </w:r>
+      <w:r>
+        <w:rPr>
+          <w:b w:val="1"/>
+          <w:color w:val="980000"/>
+          <w:rtl w:val="0"/>
+        </w:rPr>
+        <w:t xml:space="preserve">perjudiquen</w:t>
+      </w:r>
+      <w:r>
+        <w:rPr>
+          <w:rtl w:val="0"/>
+        </w:rPr>
+        <w:t xml:space="preserve">.</w:t>
+      </w:r>
+    </w:p>
+    <w:p>
+      <w:pPr>
+        <w:keepNext w:val="0"/>
+        <w:keepLines w:val="0"/>
+        <w:pageBreakBefore w:val="0"/>
+        <w:widowControl w:val="1"/>
+        <w:pBdr>
+          <w:top w:space="0" w:sz="0" w:val="nil"/>
+          <w:left w:space="0" w:sz="0" w:val="nil"/>
+          <w:bottom w:space="0" w:sz="0" w:val="nil"/>
+          <w:right w:space="0" w:sz="0" w:val="nil"/>
+          <w:between w:space="0" w:sz="0" w:val="nil"/>
+        </w:pBdr>
+        <w:shd w:fill="auto" w:val="clear"/>
+        <w:spacing w:after="0" w:before="40" w:line="240" w:lineRule="auto"/>
+        <w:ind w:right="0"/>
+        <w:jc w:val="left"/>
+        <w:rPr/>
+      </w:pPr>
+      <w:r>
+        <w:rPr>
+          <w:rtl w:val="0"/>
+        </w:rPr>
+      </w:r>
+    </w:p>
+    <w:p>
+      <w:pPr>
+        <w:keepNext w:val="0"/>
+        <w:keepLines w:val="0"/>
+        <w:pageBreakBefore w:val="0"/>
+        <w:widowControl w:val="1"/>
+        <w:pBdr>
+          <w:top w:space="0" w:sz="0" w:val="nil"/>
+          <w:left w:space="0" w:sz="0" w:val="nil"/>
+          <w:bottom w:space="0" w:sz="0" w:val="nil"/>
+          <w:right w:space="0" w:sz="0" w:val="nil"/>
+          <w:between w:space="0" w:sz="0" w:val="nil"/>
+        </w:pBdr>
+        <w:shd w:fill="auto" w:val="clear"/>
+        <w:spacing w:after="0" w:before="40" w:line="240" w:lineRule="auto"/>
+        <w:ind w:right="0"/>
+        <w:jc w:val="left"/>
+        <w:rPr/>
+      </w:pPr>
+      <w:r>
+        <w:rPr>
+          <w:rtl w:val="0"/>
+        </w:rPr>
+      </w:r>
+      <w:r>
+        <mc:AlternateContent>
+          <mc:Choice Requires="wpg">
+            <w:drawing>
+              <wp:anchor allowOverlap="1" behindDoc="0" distB="114300" distT="114300" distL="114300" distR="114300" hidden="0" layoutInCell="1" locked="0" relativeHeight="0" simplePos="0">
+                <wp:simplePos x="0" y="0"/>
+                <wp:positionH relativeFrom="column">
+                  <wp:posOffset>114300</wp:posOffset>
+                </wp:positionH>
+                <wp:positionV relativeFrom="paragraph">
+                  <wp:posOffset>139700</wp:posOffset>
+                </wp:positionV>
+                <wp:extent cx="5157788" cy="4521437"/>
+                <wp:effectExtent b="0" l="0" r="0" t="0"/>
+                <wp:wrapSquare wrapText="bothSides" distB="114300" distT="114300" distL="114300" distR="114300"/>
+                <wp:docPr id="4" name=""/>
+                <a:graphic>
+                  <a:graphicData uri="http://schemas.microsoft.com/office/word/2010/wordprocessingGroup">
+                    <wpg:wgp>
+                      <wpg:cNvGrpSpPr/>
+                      <wpg:grpSpPr>
+                        <a:xfrm>
+                          <a:off x="292450" y="580575"/>
+                          <a:ext cx="5157788" cy="4521437"/>
+                          <a:chOff x="292450" y="580575"/>
+                          <a:chExt cx="5852825" cy="5134425"/>
+                        </a:xfrm>
+                      </wpg:grpSpPr>
+                      <wps:wsp>
+                        <wps:cNvCnPr/>
+                        <wps:spPr>
+                          <a:xfrm>
+                            <a:off x="3117662" y="580625"/>
+                            <a:ext cx="18900" cy="5450400"/>
+                          </a:xfrm>
+                          <a:prstGeom prst="straightConnector1">
+                            <a:avLst/>
+                          </a:prstGeom>
+                          <a:noFill/>
+                          <a:ln cap="flat" cmpd="sng" w="19050">
+                            <a:solidFill>
+                              <a:srgbClr val="000000"/>
+                            </a:solidFill>
+                            <a:prstDash val="solid"/>
+                            <a:round/>
+                            <a:headEnd len="med" w="med" type="none"/>
+                            <a:tailEnd len="med" w="med" type="none"/>
+                          </a:ln>
+                        </wps:spPr>
+                        <wps:bodyPr anchorCtr="0" anchor="ctr" bIns="168125" lIns="168125" spcFirstLastPara="1" rIns="168125" wrap="square" tIns="168125">
+                          <a:noAutofit/>
+                        </wps:bodyPr>
+                      </wps:wsp>
+                      <wps:wsp>
+                        <wps:cNvSpPr txBox="1"/>
+                        <wps:cNvPr id="3" name="Shape 3"/>
+                        <wps:spPr>
+                          <a:xfrm>
+                            <a:off x="292475" y="746775"/>
+                            <a:ext cx="3008700" cy="790500"/>
+                          </a:xfrm>
+                          <a:prstGeom prst="rect">
+                            <a:avLst/>
+                          </a:prstGeom>
+                          <a:noFill/>
+                          <a:ln>
+                            <a:noFill/>
+                          </a:ln>
+                        </wps:spPr>
+                        <wps:txbx>
+                          <w:txbxContent>
+                            <w:p>
+                              <w:pPr>
+                                <w:spacing w:after="0" w:before="0" w:line="240"/>
+                                <w:ind w:left="0" w:right="0" w:firstLine="0"/>
+                                <w:jc w:val="center"/>
+                                <w:textDirection w:val="btLr"/>
+                              </w:pPr>
+                              <w:r>
+                                <w:rPr>
+                                  <w:rFonts w:ascii="Montserrat" w:cs="Montserrat" w:eastAsia="Montserrat" w:hAnsi="Montserrat"/>
+                                  <w:b w:val="0"/>
+                                  <w:i w:val="0"/>
+                                  <w:smallCaps w:val="0"/>
+                                  <w:strike w:val="0"/>
+                                  <w:color w:val="000000"/>
+                                  <w:sz w:val="20"/>
+                                  <w:vertAlign w:val="baseline"/>
+                                </w:rPr>
+                                <w:t xml:space="preserve">Punts </w:t>
+                              </w:r>
+                              <w:r>
+                                <w:rPr>
+                                  <w:rFonts w:ascii="Montserrat" w:cs="Montserrat" w:eastAsia="Montserrat" w:hAnsi="Montserrat"/>
+                                  <w:b w:val="1"/>
+                                  <w:i w:val="0"/>
+                                  <w:smallCaps w:val="0"/>
+                                  <w:strike w:val="0"/>
+                                  <w:color w:val="38761d"/>
+                                  <w:sz w:val="20"/>
+                                  <w:vertAlign w:val="baseline"/>
+                                </w:rPr>
+                                <w:t xml:space="preserve">a favor</w:t>
+                              </w:r>
+                              <w:r>
+                                <w:rPr>
+                                  <w:rFonts w:ascii="Montserrat" w:cs="Montserrat" w:eastAsia="Montserrat" w:hAnsi="Montserrat"/>
+                                  <w:b w:val="0"/>
+                                  <w:i w:val="0"/>
+                                  <w:smallCaps w:val="0"/>
+                                  <w:strike w:val="0"/>
+                                  <w:color w:val="000000"/>
+                                  <w:sz w:val="20"/>
+                                  <w:vertAlign w:val="baseline"/>
+                                </w:rPr>
+                                <w:t xml:space="preserve"> del nostre punt de vista</w:t>
+                              </w:r>
+                            </w:p>
+                          </w:txbxContent>
+                        </wps:txbx>
+                        <wps:bodyPr anchorCtr="0" anchor="t" bIns="168125" lIns="168125" spcFirstLastPara="1" rIns="168125" wrap="square" tIns="168125">
+                          <a:noAutofit/>
+                        </wps:bodyPr>
+                      </wps:wsp>
+                      <wps:wsp>
+                        <wps:cNvSpPr txBox="1"/>
+                        <wps:cNvPr id="4" name="Shape 4"/>
+                        <wps:spPr>
+                          <a:xfrm>
+                            <a:off x="3136553" y="746776"/>
+                            <a:ext cx="3008700" cy="790500"/>
+                          </a:xfrm>
+                          <a:prstGeom prst="rect">
+                            <a:avLst/>
+                          </a:prstGeom>
+                          <a:noFill/>
+                          <a:ln>
+                            <a:noFill/>
+                          </a:ln>
+                        </wps:spPr>
+                        <wps:txbx>
+                          <w:txbxContent>
+                            <w:p>
+                              <w:pPr>
+                                <w:spacing w:after="0" w:before="0" w:line="240"/>
+                                <w:ind w:left="0" w:right="0" w:firstLine="0"/>
+                                <w:jc w:val="center"/>
+                                <w:textDirection w:val="btLr"/>
+                              </w:pPr>
+                              <w:r>
+                                <w:rPr>
+                                  <w:rFonts w:ascii="Montserrat" w:cs="Montserrat" w:eastAsia="Montserrat" w:hAnsi="Montserrat"/>
+                                  <w:b w:val="0"/>
+                                  <w:i w:val="0"/>
+                                  <w:smallCaps w:val="0"/>
+                                  <w:strike w:val="0"/>
+                                  <w:color w:val="000000"/>
+                                  <w:sz w:val="20"/>
+                                  <w:vertAlign w:val="baseline"/>
+                                </w:rPr>
+                                <w:t xml:space="preserve">Punts </w:t>
+                              </w:r>
+                              <w:r>
+                                <w:rPr>
+                                  <w:rFonts w:ascii="Montserrat" w:cs="Montserrat" w:eastAsia="Montserrat" w:hAnsi="Montserrat"/>
+                                  <w:b w:val="1"/>
+                                  <w:i w:val="0"/>
+                                  <w:smallCaps w:val="0"/>
+                                  <w:strike w:val="0"/>
+                                  <w:color w:val="980000"/>
+                                  <w:sz w:val="20"/>
+                                  <w:vertAlign w:val="baseline"/>
+                                </w:rPr>
+                                <w:t xml:space="preserve">en contra </w:t>
+                              </w:r>
+                              <w:r>
+                                <w:rPr>
+                                  <w:rFonts w:ascii="Montserrat" w:cs="Montserrat" w:eastAsia="Montserrat" w:hAnsi="Montserrat"/>
+                                  <w:b w:val="0"/>
+                                  <w:i w:val="0"/>
+                                  <w:smallCaps w:val="0"/>
+                                  <w:strike w:val="0"/>
+                                  <w:color w:val="000000"/>
+                                  <w:sz w:val="20"/>
+                                  <w:vertAlign w:val="baseline"/>
+                                </w:rPr>
+                                <w:t xml:space="preserve">del nostre punt de vista</w:t>
+                              </w:r>
+                            </w:p>
+                          </w:txbxContent>
+                        </wps:txbx>
+                        <wps:bodyPr anchorCtr="0" anchor="t" bIns="168125" lIns="168125" spcFirstLastPara="1" rIns="168125" wrap="square" tIns="168125">
+                          <a:noAutofit/>
+                        </wps:bodyPr>
+                      </wps:wsp>
+                      <wps:wsp>
+                        <wps:cNvSpPr txBox="1"/>
+                        <wps:cNvPr id="5" name="Shape 5"/>
+                        <wps:spPr>
+                          <a:xfrm>
+                            <a:off x="369301" y="3569050"/>
+                            <a:ext cx="2748000" cy="790500"/>
+                          </a:xfrm>
+                          <a:prstGeom prst="rect">
+                            <a:avLst/>
+                          </a:prstGeom>
+                          <a:noFill/>
+                          <a:ln>
+                            <a:noFill/>
+                          </a:ln>
+                        </wps:spPr>
+                        <wps:txbx>
+                          <w:txbxContent>
+                            <w:p>
+                              <w:pPr>
+                                <w:spacing w:after="0" w:before="0" w:line="240"/>
+                                <w:ind w:left="0" w:right="0" w:firstLine="0"/>
+                                <w:jc w:val="center"/>
+                                <w:textDirection w:val="btLr"/>
+                              </w:pPr>
+                              <w:r>
+                                <w:rPr>
+                                  <w:rFonts w:ascii="Montserrat" w:cs="Montserrat" w:eastAsia="Montserrat" w:hAnsi="Montserrat"/>
+                                  <w:b w:val="0"/>
+                                  <w:i w:val="0"/>
+                                  <w:smallCaps w:val="0"/>
+                                  <w:strike w:val="0"/>
+                                  <w:color w:val="000000"/>
+                                  <w:sz w:val="20"/>
+                                  <w:vertAlign w:val="baseline"/>
+                                </w:rPr>
+                                <w:t xml:space="preserve">Punts </w:t>
+                              </w:r>
+                              <w:r>
+                                <w:rPr>
+                                  <w:rFonts w:ascii="Montserrat" w:cs="Montserrat" w:eastAsia="Montserrat" w:hAnsi="Montserrat"/>
+                                  <w:b w:val="1"/>
+                                  <w:i w:val="0"/>
+                                  <w:smallCaps w:val="0"/>
+                                  <w:strike w:val="0"/>
+                                  <w:color w:val="980000"/>
+                                  <w:sz w:val="20"/>
+                                  <w:vertAlign w:val="baseline"/>
+                                </w:rPr>
+                                <w:t xml:space="preserve">a favor de l’altre </w:t>
+                              </w:r>
+                              <w:r>
+                                <w:rPr>
+                                  <w:rFonts w:ascii="Montserrat" w:cs="Montserrat" w:eastAsia="Montserrat" w:hAnsi="Montserrat"/>
+                                  <w:b w:val="0"/>
+                                  <w:i w:val="0"/>
+                                  <w:smallCaps w:val="0"/>
+                                  <w:strike w:val="0"/>
+                                  <w:color w:val="000000"/>
+                                  <w:sz w:val="20"/>
+                                  <w:vertAlign w:val="baseline"/>
+                                </w:rPr>
+                                <w:t xml:space="preserve">punt de vista</w:t>
+                              </w:r>
+                            </w:p>
+                          </w:txbxContent>
+                        </wps:txbx>
+                        <wps:bodyPr anchorCtr="0" anchor="t" bIns="168125" lIns="168125" spcFirstLastPara="1" rIns="168125" wrap="square" tIns="168125">
+                          <a:noAutofit/>
+                        </wps:bodyPr>
+                      </wps:wsp>
+                      <wps:wsp>
+                        <wps:cNvSpPr txBox="1"/>
+                        <wps:cNvPr id="6" name="Shape 6"/>
+                        <wps:spPr>
+                          <a:xfrm>
+                            <a:off x="3117649" y="3569050"/>
+                            <a:ext cx="2941800" cy="790500"/>
+                          </a:xfrm>
+                          <a:prstGeom prst="rect">
+                            <a:avLst/>
+                          </a:prstGeom>
+                          <a:noFill/>
+                          <a:ln>
+                            <a:noFill/>
+                          </a:ln>
+                        </wps:spPr>
+                        <wps:txbx>
+                          <w:txbxContent>
+                            <w:p>
+                              <w:pPr>
+                                <w:spacing w:after="0" w:before="0" w:line="240"/>
+                                <w:ind w:left="0" w:right="0" w:firstLine="0"/>
+                                <w:jc w:val="center"/>
+                                <w:textDirection w:val="btLr"/>
+                              </w:pPr>
+                              <w:r>
+                                <w:rPr>
+                                  <w:rFonts w:ascii="Montserrat" w:cs="Montserrat" w:eastAsia="Montserrat" w:hAnsi="Montserrat"/>
+                                  <w:b w:val="0"/>
+                                  <w:i w:val="0"/>
+                                  <w:smallCaps w:val="0"/>
+                                  <w:strike w:val="0"/>
+                                  <w:color w:val="000000"/>
+                                  <w:sz w:val="20"/>
+                                  <w:vertAlign w:val="baseline"/>
+                                </w:rPr>
+                                <w:t xml:space="preserve">Punts </w:t>
+                              </w:r>
+                              <w:r>
+                                <w:rPr>
+                                  <w:rFonts w:ascii="Montserrat" w:cs="Montserrat" w:eastAsia="Montserrat" w:hAnsi="Montserrat"/>
+                                  <w:b w:val="1"/>
+                                  <w:i w:val="0"/>
+                                  <w:smallCaps w:val="0"/>
+                                  <w:strike w:val="0"/>
+                                  <w:color w:val="38761d"/>
+                                  <w:sz w:val="20"/>
+                                  <w:vertAlign w:val="baseline"/>
+                                </w:rPr>
+                                <w:t xml:space="preserve">en contra de l’altre</w:t>
+                              </w:r>
+                              <w:r>
+                                <w:rPr>
+                                  <w:rFonts w:ascii="Montserrat" w:cs="Montserrat" w:eastAsia="Montserrat" w:hAnsi="Montserrat"/>
+                                  <w:b w:val="0"/>
+                                  <w:i w:val="0"/>
+                                  <w:smallCaps w:val="0"/>
+                                  <w:strike w:val="0"/>
+                                  <w:color w:val="000000"/>
+                                  <w:sz w:val="20"/>
+                                  <w:vertAlign w:val="baseline"/>
+                                </w:rPr>
+                                <w:t xml:space="preserve"> punt de vista</w:t>
+                              </w:r>
+                            </w:p>
+                          </w:txbxContent>
+                        </wps:txbx>
+                        <wps:bodyPr anchorCtr="0" anchor="t" bIns="168125" lIns="168125" spcFirstLastPara="1" rIns="168125" wrap="square" tIns="168125">
+                          <a:noAutofit/>
+                        </wps:bodyPr>
+                      </wps:wsp>
+                      <wps:wsp>
+                        <wps:cNvCnPr/>
+                        <wps:spPr>
+                          <a:xfrm flipH="1" rot="10800000">
+                            <a:off x="319175" y="3347025"/>
+                            <a:ext cx="5706600" cy="16800"/>
+                          </a:xfrm>
+                          <a:prstGeom prst="straightConnector1">
+                            <a:avLst/>
+                          </a:prstGeom>
+                          <a:noFill/>
+                          <a:ln cap="flat" cmpd="sng" w="19050">
+                            <a:solidFill>
+                              <a:srgbClr val="000000"/>
+                            </a:solidFill>
+                            <a:prstDash val="solid"/>
+                            <a:round/>
+                            <a:headEnd len="med" w="med" type="none"/>
+                            <a:tailEnd len="med" w="med" type="none"/>
+                          </a:ln>
+                        </wps:spPr>
+                        <wps:bodyPr anchorCtr="0" anchor="ctr" bIns="91425" lIns="91425" spcFirstLastPara="1" rIns="91425" wrap="square" tIns="91425">
+                          <a:noAutofit/>
+                        </wps:bodyPr>
+                      </wps:wsp>
+                    </wpg:wgp>
+                  </a:graphicData>
+                </a:graphic>
+              </wp:anchor>
+            </w:drawing>
+          </mc:Choice>
+          <mc:Fallback>
+            <w:drawing>
+              <wp:anchor allowOverlap="1" behindDoc="0" distB="114300" distT="114300" distL="114300" distR="114300" hidden="0" layoutInCell="1" locked="0" relativeHeight="0" simplePos="0">
+                <wp:simplePos x="0" y="0"/>
+                <wp:positionH relativeFrom="column">
+                  <wp:posOffset>114300</wp:posOffset>
+                </wp:positionH>
+                <wp:positionV relativeFrom="paragraph">
+                  <wp:posOffset>139700</wp:posOffset>
+                </wp:positionV>
+                <wp:extent cx="5157788" cy="4521437"/>
+                <wp:effectExtent b="0" l="0" r="0" t="0"/>
+                <wp:wrapSquare wrapText="bothSides" distB="114300" distT="114300" distL="114300" distR="114300"/>
+                <wp:docPr id="4" name="image4.png"/>
+                <a:graphic>
+                  <a:graphicData uri="http://schemas.openxmlformats.org/drawingml/2006/picture">
+                    <pic:pic>
+                      <pic:nvPicPr>
+                        <pic:cNvPr id="0" name="image4.png"/>
+                        <pic:cNvPicPr preferRelativeResize="0"/>
+                      </pic:nvPicPr>
+                      <pic:blipFill>
+                        <a:blip r:embed="rId6"/>
+                        <a:srcRect/>
+                        <a:stretch>
+                          <a:fillRect/>
+                        </a:stretch>
+                      </pic:blipFill>
+                      <pic:spPr>
+                        <a:xfrm>
+                          <a:off x="0" y="0"/>
+                          <a:ext cx="5157788" cy="4521437"/>
+                        </a:xfrm>
+                        <a:prstGeom prst="rect"/>
+                        <a:ln/>
+                      </pic:spPr>
+                    </pic:pic>
+                  </a:graphicData>
+                </a:graphic>
+              </wp:anchor>
+            </w:drawing>
+          </mc:Fallback>
+        </mc:AlternateContent>
       </w:r>
     </w:p>
     <w:p>
@@ -3412,252 +4146,560 @@
     </w:p>
     <w:p>
       <w:pPr>
-        <w:keepNext w:val="0"/>
-        <w:keepLines w:val="0"/>
-        <w:pageBreakBefore w:val="0"/>
-        <w:widowControl w:val="1"/>
-        <w:pBdr>
-          <w:top w:space="0" w:sz="0" w:val="nil"/>
-          <w:left w:space="0" w:sz="0" w:val="nil"/>
-          <w:bottom w:space="0" w:sz="0" w:val="nil"/>
-          <w:right w:space="0" w:sz="0" w:val="nil"/>
-          <w:between w:space="0" w:sz="0" w:val="nil"/>
-        </w:pBdr>
-        <w:shd w:fill="auto" w:val="clear"/>
-        <w:spacing w:after="0" w:before="40" w:line="240" w:lineRule="auto"/>
-        <w:ind w:right="0"/>
-        <w:jc w:val="left"/>
-        <w:rPr/>
-      </w:pPr>
-      <w:r>
-        <w:rPr>
-          <w:rtl w:val="0"/>
-        </w:rPr>
-      </w:r>
-    </w:p>
-    <w:p>
-      <w:pPr>
-        <w:keepNext w:val="0"/>
-        <w:keepLines w:val="0"/>
-        <w:pageBreakBefore w:val="0"/>
-        <w:widowControl w:val="1"/>
-        <w:pBdr>
-          <w:top w:space="0" w:sz="0" w:val="nil"/>
-          <w:left w:space="0" w:sz="0" w:val="nil"/>
-          <w:bottom w:space="0" w:sz="0" w:val="nil"/>
-          <w:right w:space="0" w:sz="0" w:val="nil"/>
-          <w:between w:space="0" w:sz="0" w:val="nil"/>
-        </w:pBdr>
-        <w:shd w:fill="auto" w:val="clear"/>
-        <w:spacing w:after="0" w:before="40" w:line="240" w:lineRule="auto"/>
-        <w:ind w:right="0"/>
-        <w:jc w:val="left"/>
-        <w:rPr/>
-      </w:pPr>
-      <w:r>
-        <w:rPr>
-          <w:rtl w:val="0"/>
-        </w:rPr>
-      </w:r>
-    </w:p>
-    <w:p>
-      <w:pPr>
-        <w:keepNext w:val="0"/>
-        <w:keepLines w:val="0"/>
-        <w:pageBreakBefore w:val="0"/>
-        <w:widowControl w:val="1"/>
-        <w:pBdr>
-          <w:top w:space="0" w:sz="0" w:val="nil"/>
-          <w:left w:space="0" w:sz="0" w:val="nil"/>
-          <w:bottom w:space="0" w:sz="0" w:val="nil"/>
-          <w:right w:space="0" w:sz="0" w:val="nil"/>
-          <w:between w:space="0" w:sz="0" w:val="nil"/>
-        </w:pBdr>
-        <w:shd w:fill="auto" w:val="clear"/>
-        <w:spacing w:after="0" w:before="40" w:line="240" w:lineRule="auto"/>
-        <w:ind w:right="0"/>
-        <w:jc w:val="left"/>
-        <w:rPr/>
-      </w:pPr>
-      <w:r>
-        <w:rPr>
-          <w:rtl w:val="0"/>
-        </w:rPr>
-      </w:r>
-    </w:p>
-    <w:p>
-      <w:pPr>
-        <w:keepNext w:val="0"/>
-        <w:keepLines w:val="0"/>
-        <w:pageBreakBefore w:val="0"/>
-        <w:widowControl w:val="1"/>
-        <w:pBdr>
-          <w:top w:space="0" w:sz="0" w:val="nil"/>
-          <w:left w:space="0" w:sz="0" w:val="nil"/>
-          <w:bottom w:space="0" w:sz="0" w:val="nil"/>
-          <w:right w:space="0" w:sz="0" w:val="nil"/>
-          <w:between w:space="0" w:sz="0" w:val="nil"/>
-        </w:pBdr>
-        <w:shd w:fill="auto" w:val="clear"/>
-        <w:spacing w:after="0" w:before="40" w:line="240" w:lineRule="auto"/>
-        <w:ind w:right="0"/>
-        <w:jc w:val="left"/>
-        <w:rPr/>
-      </w:pPr>
-      <w:r>
-        <w:rPr>
-          <w:rtl w:val="0"/>
-        </w:rPr>
-      </w:r>
-    </w:p>
-    <w:p>
-      <w:pPr>
-        <w:keepNext w:val="0"/>
-        <w:keepLines w:val="0"/>
-        <w:pageBreakBefore w:val="0"/>
-        <w:widowControl w:val="1"/>
-        <w:pBdr>
-          <w:top w:space="0" w:sz="0" w:val="nil"/>
-          <w:left w:space="0" w:sz="0" w:val="nil"/>
-          <w:bottom w:space="0" w:sz="0" w:val="nil"/>
-          <w:right w:space="0" w:sz="0" w:val="nil"/>
-          <w:between w:space="0" w:sz="0" w:val="nil"/>
-        </w:pBdr>
-        <w:shd w:fill="auto" w:val="clear"/>
-        <w:spacing w:after="0" w:before="40" w:line="240" w:lineRule="auto"/>
-        <w:ind w:right="0"/>
-        <w:jc w:val="left"/>
-        <w:rPr/>
-      </w:pPr>
-      <w:r>
-        <w:rPr>
-          <w:rtl w:val="0"/>
-        </w:rPr>
-      </w:r>
-    </w:p>
-    <w:p>
-      <w:pPr>
-        <w:keepNext w:val="0"/>
-        <w:keepLines w:val="0"/>
-        <w:pageBreakBefore w:val="0"/>
-        <w:widowControl w:val="1"/>
-        <w:pBdr>
-          <w:top w:space="0" w:sz="0" w:val="nil"/>
-          <w:left w:space="0" w:sz="0" w:val="nil"/>
-          <w:bottom w:space="0" w:sz="0" w:val="nil"/>
-          <w:right w:space="0" w:sz="0" w:val="nil"/>
-          <w:between w:space="0" w:sz="0" w:val="nil"/>
-        </w:pBdr>
-        <w:shd w:fill="auto" w:val="clear"/>
-        <w:spacing w:after="0" w:before="40" w:line="240" w:lineRule="auto"/>
-        <w:ind w:right="0"/>
-        <w:jc w:val="left"/>
-        <w:rPr/>
-      </w:pPr>
-      <w:r>
-        <w:rPr>
-          <w:rtl w:val="0"/>
-        </w:rPr>
-      </w:r>
-    </w:p>
-    <w:p>
-      <w:pPr>
-        <w:keepNext w:val="0"/>
-        <w:keepLines w:val="0"/>
-        <w:pageBreakBefore w:val="0"/>
-        <w:widowControl w:val="1"/>
-        <w:pBdr>
-          <w:top w:space="0" w:sz="0" w:val="nil"/>
-          <w:left w:space="0" w:sz="0" w:val="nil"/>
-          <w:bottom w:space="0" w:sz="0" w:val="nil"/>
-          <w:right w:space="0" w:sz="0" w:val="nil"/>
-          <w:between w:space="0" w:sz="0" w:val="nil"/>
-        </w:pBdr>
-        <w:shd w:fill="auto" w:val="clear"/>
-        <w:spacing w:after="0" w:before="40" w:line="240" w:lineRule="auto"/>
-        <w:ind w:right="0"/>
-        <w:jc w:val="left"/>
-        <w:rPr/>
-      </w:pPr>
-      <w:r>
-        <w:rPr>
-          <w:rtl w:val="0"/>
-        </w:rPr>
-      </w:r>
-    </w:p>
-    <w:p>
-      <w:pPr>
-        <w:keepNext w:val="0"/>
-        <w:keepLines w:val="0"/>
-        <w:pageBreakBefore w:val="0"/>
-        <w:widowControl w:val="1"/>
-        <w:pBdr>
-          <w:top w:space="0" w:sz="0" w:val="nil"/>
-          <w:left w:space="0" w:sz="0" w:val="nil"/>
-          <w:bottom w:space="0" w:sz="0" w:val="nil"/>
-          <w:right w:space="0" w:sz="0" w:val="nil"/>
-          <w:between w:space="0" w:sz="0" w:val="nil"/>
-        </w:pBdr>
-        <w:shd w:fill="auto" w:val="clear"/>
-        <w:spacing w:after="0" w:before="40" w:line="240" w:lineRule="auto"/>
-        <w:ind w:right="0"/>
-        <w:jc w:val="left"/>
-        <w:rPr/>
-      </w:pPr>
-      <w:r>
-        <w:rPr>
-          <w:rtl w:val="0"/>
-        </w:rPr>
-      </w:r>
-    </w:p>
-    <w:p>
-      <w:pPr>
-        <w:keepNext w:val="0"/>
-        <w:keepLines w:val="0"/>
-        <w:pageBreakBefore w:val="0"/>
-        <w:widowControl w:val="1"/>
-        <w:pBdr>
-          <w:top w:space="0" w:sz="0" w:val="nil"/>
-          <w:left w:space="0" w:sz="0" w:val="nil"/>
-          <w:bottom w:space="0" w:sz="0" w:val="nil"/>
-          <w:right w:space="0" w:sz="0" w:val="nil"/>
-          <w:between w:space="0" w:sz="0" w:val="nil"/>
-        </w:pBdr>
-        <w:shd w:fill="auto" w:val="clear"/>
-        <w:spacing w:after="0" w:before="40" w:line="240" w:lineRule="auto"/>
-        <w:ind w:right="0"/>
-        <w:jc w:val="left"/>
-        <w:rPr/>
-      </w:pPr>
-      <w:r>
-        <w:rPr>
-          <w:rtl w:val="0"/>
-        </w:rPr>
-      </w:r>
-    </w:p>
-    <w:p>
-      <w:pPr>
-        <w:keepNext w:val="0"/>
-        <w:keepLines w:val="0"/>
-        <w:pageBreakBefore w:val="0"/>
-        <w:widowControl w:val="1"/>
-        <w:pBdr>
-          <w:top w:space="0" w:sz="0" w:val="nil"/>
-          <w:left w:space="0" w:sz="0" w:val="nil"/>
-          <w:bottom w:space="0" w:sz="0" w:val="nil"/>
-          <w:right w:space="0" w:sz="0" w:val="nil"/>
-          <w:between w:space="0" w:sz="0" w:val="nil"/>
-        </w:pBdr>
-        <w:shd w:fill="auto" w:val="clear"/>
-        <w:spacing w:after="0" w:before="40" w:line="240" w:lineRule="auto"/>
-        <w:ind w:right="0"/>
-        <w:jc w:val="left"/>
-        <w:rPr/>
-      </w:pPr>
-      <w:r>
-        <w:rPr>
-          <w:rtl w:val="0"/>
-        </w:rPr>
+        <w:rPr/>
+      </w:pPr>
+      <w:r>
+        <w:pict>
+          <v:rect style="width:0.0pt;height:1.5pt" o:hr="t" o:hrstd="t" o:hralign="center" fillcolor="#A0A0A0" stroked="f"/>
+        </w:pict>
+      </w:r>
+      <w:r>
+        <w:rPr>
+          <w:rtl w:val="0"/>
+        </w:rPr>
+      </w:r>
+    </w:p>
+    <w:p>
+      <w:pPr>
+        <w:rPr/>
+      </w:pPr>
+      <w:r>
+        <w:rPr>
+          <w:rtl w:val="0"/>
+        </w:rPr>
+      </w:r>
+    </w:p>
+    <w:p>
+      <w:pPr>
+        <w:spacing w:before="40" w:line="240" w:lineRule="auto"/>
+        <w:jc w:val="left"/>
+        <w:rPr>
+          <w:b w:val="1"/>
+        </w:rPr>
+      </w:pPr>
+      <w:r>
+        <w:rPr>
+          <w:b w:val="1"/>
+          <w:rtl w:val="0"/>
+        </w:rPr>
+        <w:t xml:space="preserve">Taula d’ajuda</w:t>
+      </w:r>
+    </w:p>
+    <w:p>
+      <w:pPr>
+        <w:spacing w:before="40" w:line="240" w:lineRule="auto"/>
+        <w:jc w:val="left"/>
+        <w:rPr>
+          <w:b w:val="1"/>
+        </w:rPr>
+      </w:pPr>
+      <w:r>
+        <w:rPr>
+          <w:rtl w:val="0"/>
+        </w:rPr>
+      </w:r>
+    </w:p>
+    <w:p>
+      <w:pPr>
+        <w:spacing w:before="40" w:line="240" w:lineRule="auto"/>
+        <w:jc w:val="left"/>
+        <w:rPr/>
+      </w:pPr>
+      <w:r>
+        <w:rPr>
+          <w:rtl w:val="0"/>
+        </w:rPr>
+        <w:t xml:space="preserve">Empleneu aquesta taula i penseu com reforçar els arguments que us </w:t>
+      </w:r>
+      <w:r>
+        <w:rPr>
+          <w:b w:val="1"/>
+          <w:color w:val="38761d"/>
+          <w:rtl w:val="0"/>
+        </w:rPr>
+        <w:t xml:space="preserve">beneficien </w:t>
+      </w:r>
+      <w:r>
+        <w:rPr>
+          <w:rtl w:val="0"/>
+        </w:rPr>
+        <w:t xml:space="preserve">i rebatre els arguments que us </w:t>
+      </w:r>
+      <w:r>
+        <w:rPr>
+          <w:b w:val="1"/>
+          <w:color w:val="980000"/>
+          <w:rtl w:val="0"/>
+        </w:rPr>
+        <w:t xml:space="preserve">perjudiquen</w:t>
+      </w:r>
+      <w:r>
+        <w:rPr>
+          <w:rtl w:val="0"/>
+        </w:rPr>
+        <w:t xml:space="preserve">.</w:t>
+      </w:r>
+    </w:p>
+    <w:p>
+      <w:pPr>
+        <w:keepNext w:val="0"/>
+        <w:keepLines w:val="0"/>
+        <w:pageBreakBefore w:val="0"/>
+        <w:widowControl w:val="1"/>
+        <w:pBdr>
+          <w:top w:space="0" w:sz="0" w:val="nil"/>
+          <w:left w:space="0" w:sz="0" w:val="nil"/>
+          <w:bottom w:space="0" w:sz="0" w:val="nil"/>
+          <w:right w:space="0" w:sz="0" w:val="nil"/>
+          <w:between w:space="0" w:sz="0" w:val="nil"/>
+        </w:pBdr>
+        <w:shd w:fill="auto" w:val="clear"/>
+        <w:spacing w:after="0" w:before="40" w:line="240" w:lineRule="auto"/>
+        <w:ind w:right="0"/>
+        <w:jc w:val="left"/>
+        <w:rPr/>
+      </w:pPr>
+      <w:r>
+        <w:rPr>
+          <w:rtl w:val="0"/>
+        </w:rPr>
+      </w:r>
+    </w:p>
+    <w:p>
+      <w:pPr>
+        <w:keepNext w:val="0"/>
+        <w:keepLines w:val="0"/>
+        <w:pageBreakBefore w:val="0"/>
+        <w:widowControl w:val="1"/>
+        <w:pBdr>
+          <w:top w:space="0" w:sz="0" w:val="nil"/>
+          <w:left w:space="0" w:sz="0" w:val="nil"/>
+          <w:bottom w:space="0" w:sz="0" w:val="nil"/>
+          <w:right w:space="0" w:sz="0" w:val="nil"/>
+          <w:between w:space="0" w:sz="0" w:val="nil"/>
+        </w:pBdr>
+        <w:shd w:fill="auto" w:val="clear"/>
+        <w:spacing w:after="0" w:before="40" w:line="240" w:lineRule="auto"/>
+        <w:ind w:right="0"/>
+        <w:jc w:val="left"/>
+        <w:rPr/>
+      </w:pPr>
+      <w:r>
+        <w:rPr>
+          <w:rtl w:val="0"/>
+        </w:rPr>
+      </w:r>
+      <w:r>
+        <mc:AlternateContent>
+          <mc:Choice Requires="wpg">
+            <w:drawing>
+              <wp:anchor allowOverlap="1" behindDoc="0" distB="114300" distT="114300" distL="114300" distR="114300" hidden="0" layoutInCell="1" locked="0" relativeHeight="0" simplePos="0">
+                <wp:simplePos x="0" y="0"/>
+                <wp:positionH relativeFrom="column">
+                  <wp:posOffset>114300</wp:posOffset>
+                </wp:positionH>
+                <wp:positionV relativeFrom="paragraph">
+                  <wp:posOffset>139700</wp:posOffset>
+                </wp:positionV>
+                <wp:extent cx="5157788" cy="4521437"/>
+                <wp:effectExtent b="0" l="0" r="0" t="0"/>
+                <wp:wrapSquare wrapText="bothSides" distB="114300" distT="114300" distL="114300" distR="114300"/>
+                <wp:docPr id="2" name=""/>
+                <a:graphic>
+                  <a:graphicData uri="http://schemas.microsoft.com/office/word/2010/wordprocessingGroup">
+                    <wpg:wgp>
+                      <wpg:cNvGrpSpPr/>
+                      <wpg:grpSpPr>
+                        <a:xfrm>
+                          <a:off x="292450" y="580575"/>
+                          <a:ext cx="5157788" cy="4521437"/>
+                          <a:chOff x="292450" y="580575"/>
+                          <a:chExt cx="5852825" cy="5134425"/>
+                        </a:xfrm>
+                      </wpg:grpSpPr>
+                      <wps:wsp>
+                        <wps:cNvCnPr/>
+                        <wps:spPr>
+                          <a:xfrm>
+                            <a:off x="3117662" y="580625"/>
+                            <a:ext cx="18900" cy="5450400"/>
+                          </a:xfrm>
+                          <a:prstGeom prst="straightConnector1">
+                            <a:avLst/>
+                          </a:prstGeom>
+                          <a:noFill/>
+                          <a:ln cap="flat" cmpd="sng" w="19050">
+                            <a:solidFill>
+                              <a:srgbClr val="000000"/>
+                            </a:solidFill>
+                            <a:prstDash val="solid"/>
+                            <a:round/>
+                            <a:headEnd len="med" w="med" type="none"/>
+                            <a:tailEnd len="med" w="med" type="none"/>
+                          </a:ln>
+                        </wps:spPr>
+                        <wps:bodyPr anchorCtr="0" anchor="ctr" bIns="168125" lIns="168125" spcFirstLastPara="1" rIns="168125" wrap="square" tIns="168125">
+                          <a:noAutofit/>
+                        </wps:bodyPr>
+                      </wps:wsp>
+                      <wps:wsp>
+                        <wps:cNvSpPr txBox="1"/>
+                        <wps:cNvPr id="3" name="Shape 3"/>
+                        <wps:spPr>
+                          <a:xfrm>
+                            <a:off x="292475" y="746775"/>
+                            <a:ext cx="3008700" cy="790500"/>
+                          </a:xfrm>
+                          <a:prstGeom prst="rect">
+                            <a:avLst/>
+                          </a:prstGeom>
+                          <a:noFill/>
+                          <a:ln>
+                            <a:noFill/>
+                          </a:ln>
+                        </wps:spPr>
+                        <wps:txbx>
+                          <w:txbxContent>
+                            <w:p>
+                              <w:pPr>
+                                <w:spacing w:after="0" w:before="0" w:line="240"/>
+                                <w:ind w:left="0" w:right="0" w:firstLine="0"/>
+                                <w:jc w:val="center"/>
+                                <w:textDirection w:val="btLr"/>
+                              </w:pPr>
+                              <w:r>
+                                <w:rPr>
+                                  <w:rFonts w:ascii="Montserrat" w:cs="Montserrat" w:eastAsia="Montserrat" w:hAnsi="Montserrat"/>
+                                  <w:b w:val="0"/>
+                                  <w:i w:val="0"/>
+                                  <w:smallCaps w:val="0"/>
+                                  <w:strike w:val="0"/>
+                                  <w:color w:val="000000"/>
+                                  <w:sz w:val="20"/>
+                                  <w:vertAlign w:val="baseline"/>
+                                </w:rPr>
+                                <w:t xml:space="preserve">Punts </w:t>
+                              </w:r>
+                              <w:r>
+                                <w:rPr>
+                                  <w:rFonts w:ascii="Montserrat" w:cs="Montserrat" w:eastAsia="Montserrat" w:hAnsi="Montserrat"/>
+                                  <w:b w:val="1"/>
+                                  <w:i w:val="0"/>
+                                  <w:smallCaps w:val="0"/>
+                                  <w:strike w:val="0"/>
+                                  <w:color w:val="38761d"/>
+                                  <w:sz w:val="20"/>
+                                  <w:vertAlign w:val="baseline"/>
+                                </w:rPr>
+                                <w:t xml:space="preserve">a favor</w:t>
+                              </w:r>
+                              <w:r>
+                                <w:rPr>
+                                  <w:rFonts w:ascii="Montserrat" w:cs="Montserrat" w:eastAsia="Montserrat" w:hAnsi="Montserrat"/>
+                                  <w:b w:val="0"/>
+                                  <w:i w:val="0"/>
+                                  <w:smallCaps w:val="0"/>
+                                  <w:strike w:val="0"/>
+                                  <w:color w:val="000000"/>
+                                  <w:sz w:val="20"/>
+                                  <w:vertAlign w:val="baseline"/>
+                                </w:rPr>
+                                <w:t xml:space="preserve"> del nostre punt de vista</w:t>
+                              </w:r>
+                            </w:p>
+                          </w:txbxContent>
+                        </wps:txbx>
+                        <wps:bodyPr anchorCtr="0" anchor="t" bIns="168125" lIns="168125" spcFirstLastPara="1" rIns="168125" wrap="square" tIns="168125">
+                          <a:noAutofit/>
+                        </wps:bodyPr>
+                      </wps:wsp>
+                      <wps:wsp>
+                        <wps:cNvSpPr txBox="1"/>
+                        <wps:cNvPr id="4" name="Shape 4"/>
+                        <wps:spPr>
+                          <a:xfrm>
+                            <a:off x="3136553" y="746776"/>
+                            <a:ext cx="3008700" cy="790500"/>
+                          </a:xfrm>
+                          <a:prstGeom prst="rect">
+                            <a:avLst/>
+                          </a:prstGeom>
+                          <a:noFill/>
+                          <a:ln>
+                            <a:noFill/>
+                          </a:ln>
+                        </wps:spPr>
+                        <wps:txbx>
+                          <w:txbxContent>
+                            <w:p>
+                              <w:pPr>
+                                <w:spacing w:after="0" w:before="0" w:line="240"/>
+                                <w:ind w:left="0" w:right="0" w:firstLine="0"/>
+                                <w:jc w:val="center"/>
+                                <w:textDirection w:val="btLr"/>
+                              </w:pPr>
+                              <w:r>
+                                <w:rPr>
+                                  <w:rFonts w:ascii="Montserrat" w:cs="Montserrat" w:eastAsia="Montserrat" w:hAnsi="Montserrat"/>
+                                  <w:b w:val="0"/>
+                                  <w:i w:val="0"/>
+                                  <w:smallCaps w:val="0"/>
+                                  <w:strike w:val="0"/>
+                                  <w:color w:val="000000"/>
+                                  <w:sz w:val="20"/>
+                                  <w:vertAlign w:val="baseline"/>
+                                </w:rPr>
+                                <w:t xml:space="preserve">Punts </w:t>
+                              </w:r>
+                              <w:r>
+                                <w:rPr>
+                                  <w:rFonts w:ascii="Montserrat" w:cs="Montserrat" w:eastAsia="Montserrat" w:hAnsi="Montserrat"/>
+                                  <w:b w:val="1"/>
+                                  <w:i w:val="0"/>
+                                  <w:smallCaps w:val="0"/>
+                                  <w:strike w:val="0"/>
+                                  <w:color w:val="980000"/>
+                                  <w:sz w:val="20"/>
+                                  <w:vertAlign w:val="baseline"/>
+                                </w:rPr>
+                                <w:t xml:space="preserve">en contra </w:t>
+                              </w:r>
+                              <w:r>
+                                <w:rPr>
+                                  <w:rFonts w:ascii="Montserrat" w:cs="Montserrat" w:eastAsia="Montserrat" w:hAnsi="Montserrat"/>
+                                  <w:b w:val="0"/>
+                                  <w:i w:val="0"/>
+                                  <w:smallCaps w:val="0"/>
+                                  <w:strike w:val="0"/>
+                                  <w:color w:val="000000"/>
+                                  <w:sz w:val="20"/>
+                                  <w:vertAlign w:val="baseline"/>
+                                </w:rPr>
+                                <w:t xml:space="preserve">del nostre punt de vista</w:t>
+                              </w:r>
+                            </w:p>
+                          </w:txbxContent>
+                        </wps:txbx>
+                        <wps:bodyPr anchorCtr="0" anchor="t" bIns="168125" lIns="168125" spcFirstLastPara="1" rIns="168125" wrap="square" tIns="168125">
+                          <a:noAutofit/>
+                        </wps:bodyPr>
+                      </wps:wsp>
+                      <wps:wsp>
+                        <wps:cNvSpPr txBox="1"/>
+                        <wps:cNvPr id="5" name="Shape 5"/>
+                        <wps:spPr>
+                          <a:xfrm>
+                            <a:off x="369301" y="3569050"/>
+                            <a:ext cx="2748000" cy="790500"/>
+                          </a:xfrm>
+                          <a:prstGeom prst="rect">
+                            <a:avLst/>
+                          </a:prstGeom>
+                          <a:noFill/>
+                          <a:ln>
+                            <a:noFill/>
+                          </a:ln>
+                        </wps:spPr>
+                        <wps:txbx>
+                          <w:txbxContent>
+                            <w:p>
+                              <w:pPr>
+                                <w:spacing w:after="0" w:before="0" w:line="240"/>
+                                <w:ind w:left="0" w:right="0" w:firstLine="0"/>
+                                <w:jc w:val="center"/>
+                                <w:textDirection w:val="btLr"/>
+                              </w:pPr>
+                              <w:r>
+                                <w:rPr>
+                                  <w:rFonts w:ascii="Montserrat" w:cs="Montserrat" w:eastAsia="Montserrat" w:hAnsi="Montserrat"/>
+                                  <w:b w:val="0"/>
+                                  <w:i w:val="0"/>
+                                  <w:smallCaps w:val="0"/>
+                                  <w:strike w:val="0"/>
+                                  <w:color w:val="000000"/>
+                                  <w:sz w:val="20"/>
+                                  <w:vertAlign w:val="baseline"/>
+                                </w:rPr>
+                                <w:t xml:space="preserve">Punts </w:t>
+                              </w:r>
+                              <w:r>
+                                <w:rPr>
+                                  <w:rFonts w:ascii="Montserrat" w:cs="Montserrat" w:eastAsia="Montserrat" w:hAnsi="Montserrat"/>
+                                  <w:b w:val="1"/>
+                                  <w:i w:val="0"/>
+                                  <w:smallCaps w:val="0"/>
+                                  <w:strike w:val="0"/>
+                                  <w:color w:val="980000"/>
+                                  <w:sz w:val="20"/>
+                                  <w:vertAlign w:val="baseline"/>
+                                </w:rPr>
+                                <w:t xml:space="preserve">a favor de l’altre </w:t>
+                              </w:r>
+                              <w:r>
+                                <w:rPr>
+                                  <w:rFonts w:ascii="Montserrat" w:cs="Montserrat" w:eastAsia="Montserrat" w:hAnsi="Montserrat"/>
+                                  <w:b w:val="0"/>
+                                  <w:i w:val="0"/>
+                                  <w:smallCaps w:val="0"/>
+                                  <w:strike w:val="0"/>
+                                  <w:color w:val="000000"/>
+                                  <w:sz w:val="20"/>
+                                  <w:vertAlign w:val="baseline"/>
+                                </w:rPr>
+                                <w:t xml:space="preserve">punt de vista</w:t>
+                              </w:r>
+                            </w:p>
+                          </w:txbxContent>
+                        </wps:txbx>
+                        <wps:bodyPr anchorCtr="0" anchor="t" bIns="168125" lIns="168125" spcFirstLastPara="1" rIns="168125" wrap="square" tIns="168125">
+                          <a:noAutofit/>
+                        </wps:bodyPr>
+                      </wps:wsp>
+                      <wps:wsp>
+                        <wps:cNvSpPr txBox="1"/>
+                        <wps:cNvPr id="6" name="Shape 6"/>
+                        <wps:spPr>
+                          <a:xfrm>
+                            <a:off x="3117649" y="3569050"/>
+                            <a:ext cx="2941800" cy="790500"/>
+                          </a:xfrm>
+                          <a:prstGeom prst="rect">
+                            <a:avLst/>
+                          </a:prstGeom>
+                          <a:noFill/>
+                          <a:ln>
+                            <a:noFill/>
+                          </a:ln>
+                        </wps:spPr>
+                        <wps:txbx>
+                          <w:txbxContent>
+                            <w:p>
+                              <w:pPr>
+                                <w:spacing w:after="0" w:before="0" w:line="240"/>
+                                <w:ind w:left="0" w:right="0" w:firstLine="0"/>
+                                <w:jc w:val="center"/>
+                                <w:textDirection w:val="btLr"/>
+                              </w:pPr>
+                              <w:r>
+                                <w:rPr>
+                                  <w:rFonts w:ascii="Montserrat" w:cs="Montserrat" w:eastAsia="Montserrat" w:hAnsi="Montserrat"/>
+                                  <w:b w:val="0"/>
+                                  <w:i w:val="0"/>
+                                  <w:smallCaps w:val="0"/>
+                                  <w:strike w:val="0"/>
+                                  <w:color w:val="000000"/>
+                                  <w:sz w:val="20"/>
+                                  <w:vertAlign w:val="baseline"/>
+                                </w:rPr>
+                                <w:t xml:space="preserve">Punts </w:t>
+                              </w:r>
+                              <w:r>
+                                <w:rPr>
+                                  <w:rFonts w:ascii="Montserrat" w:cs="Montserrat" w:eastAsia="Montserrat" w:hAnsi="Montserrat"/>
+                                  <w:b w:val="1"/>
+                                  <w:i w:val="0"/>
+                                  <w:smallCaps w:val="0"/>
+                                  <w:strike w:val="0"/>
+                                  <w:color w:val="38761d"/>
+                                  <w:sz w:val="20"/>
+                                  <w:vertAlign w:val="baseline"/>
+                                </w:rPr>
+                                <w:t xml:space="preserve">en contra de l’altre</w:t>
+                              </w:r>
+                              <w:r>
+                                <w:rPr>
+                                  <w:rFonts w:ascii="Montserrat" w:cs="Montserrat" w:eastAsia="Montserrat" w:hAnsi="Montserrat"/>
+                                  <w:b w:val="0"/>
+                                  <w:i w:val="0"/>
+                                  <w:smallCaps w:val="0"/>
+                                  <w:strike w:val="0"/>
+                                  <w:color w:val="000000"/>
+                                  <w:sz w:val="20"/>
+                                  <w:vertAlign w:val="baseline"/>
+                                </w:rPr>
+                                <w:t xml:space="preserve"> punt de vista</w:t>
+                              </w:r>
+                            </w:p>
+                          </w:txbxContent>
+                        </wps:txbx>
+                        <wps:bodyPr anchorCtr="0" anchor="t" bIns="168125" lIns="168125" spcFirstLastPara="1" rIns="168125" wrap="square" tIns="168125">
+                          <a:noAutofit/>
+                        </wps:bodyPr>
+                      </wps:wsp>
+                      <wps:wsp>
+                        <wps:cNvCnPr/>
+                        <wps:spPr>
+                          <a:xfrm flipH="1" rot="10800000">
+                            <a:off x="319175" y="3347025"/>
+                            <a:ext cx="5706600" cy="16800"/>
+                          </a:xfrm>
+                          <a:prstGeom prst="straightConnector1">
+                            <a:avLst/>
+                          </a:prstGeom>
+                          <a:noFill/>
+                          <a:ln cap="flat" cmpd="sng" w="19050">
+                            <a:solidFill>
+                              <a:srgbClr val="000000"/>
+                            </a:solidFill>
+                            <a:prstDash val="solid"/>
+                            <a:round/>
+                            <a:headEnd len="med" w="med" type="none"/>
+                            <a:tailEnd len="med" w="med" type="none"/>
+                          </a:ln>
+                        </wps:spPr>
+                        <wps:bodyPr anchorCtr="0" anchor="ctr" bIns="91425" lIns="91425" spcFirstLastPara="1" rIns="91425" wrap="square" tIns="91425">
+                          <a:noAutofit/>
+                        </wps:bodyPr>
+                      </wps:wsp>
+                    </wpg:wgp>
+                  </a:graphicData>
+                </a:graphic>
+              </wp:anchor>
+            </w:drawing>
+          </mc:Choice>
+          <mc:Fallback>
+            <w:drawing>
+              <wp:anchor allowOverlap="1" behindDoc="0" distB="114300" distT="114300" distL="114300" distR="114300" hidden="0" layoutInCell="1" locked="0" relativeHeight="0" simplePos="0">
+                <wp:simplePos x="0" y="0"/>
+                <wp:positionH relativeFrom="column">
+                  <wp:posOffset>114300</wp:posOffset>
+                </wp:positionH>
+                <wp:positionV relativeFrom="paragraph">
+                  <wp:posOffset>139700</wp:posOffset>
+                </wp:positionV>
+                <wp:extent cx="5157788" cy="4521437"/>
+                <wp:effectExtent b="0" l="0" r="0" t="0"/>
+                <wp:wrapSquare wrapText="bothSides" distB="114300" distT="114300" distL="114300" distR="114300"/>
+                <wp:docPr id="2" name="image2.png"/>
+                <a:graphic>
+                  <a:graphicData uri="http://schemas.openxmlformats.org/drawingml/2006/picture">
+                    <pic:pic>
+                      <pic:nvPicPr>
+                        <pic:cNvPr id="0" name="image2.png"/>
+                        <pic:cNvPicPr preferRelativeResize="0"/>
+                      </pic:nvPicPr>
+                      <pic:blipFill>
+                        <a:blip r:embed="rId6"/>
+                        <a:srcRect/>
+                        <a:stretch>
+                          <a:fillRect/>
+                        </a:stretch>
+                      </pic:blipFill>
+                      <pic:spPr>
+                        <a:xfrm>
+                          <a:off x="0" y="0"/>
+                          <a:ext cx="5157788" cy="4521437"/>
+                        </a:xfrm>
+                        <a:prstGeom prst="rect"/>
+                        <a:ln/>
+                      </pic:spPr>
+                    </pic:pic>
+                  </a:graphicData>
+                </a:graphic>
+              </wp:anchor>
+            </w:drawing>
+          </mc:Fallback>
+        </mc:AlternateContent>
       </w:r>
     </w:p>
     <w:p>
@@ -4699,7 +5741,7 @@
           <w:szCs w:val="22"/>
         </w:rPr>
       </w:pPr>
-      <w:bookmarkStart w:colFirst="0" w:colLast="0" w:name="_izwyvzhi003j" w:id="26"/>
+      <w:bookmarkStart w:colFirst="0" w:colLast="0" w:name="_o5mnlfoqh228" w:id="26"/>
       <w:bookmarkEnd w:id="26"/>
       <w:r>
         <w:rPr>
@@ -4721,30 +5763,8 @@
           <w:szCs w:val="22"/>
         </w:rPr>
       </w:pPr>
-      <w:bookmarkStart w:colFirst="0" w:colLast="0" w:name="_oc6n9q8ducoy" w:id="27"/>
+      <w:bookmarkStart w:colFirst="0" w:colLast="0" w:name="_l3pe7iz0uieh" w:id="27"/>
       <w:bookmarkEnd w:id="27"/>
-      <w:r>
-        <w:rPr>
-          <w:rtl w:val="0"/>
-        </w:rPr>
-      </w:r>
-    </w:p>
-    <w:p>
-      <w:pPr>
-        <w:pStyle w:val="Heading4"/>
-        <w:keepNext w:val="0"/>
-        <w:keepLines w:val="0"/>
-        <w:spacing w:after="40" w:before="240" w:line="240" w:lineRule="auto"/>
-        <w:jc w:val="left"/>
-        <w:rPr>
-          <w:b w:val="1"/>
-          <w:color w:val="000000"/>
-          <w:sz w:val="22"/>
-          <w:szCs w:val="22"/>
-        </w:rPr>
-      </w:pPr>
-      <w:bookmarkStart w:colFirst="0" w:colLast="0" w:name="_l3pe7iz0uieh" w:id="28"/>
-      <w:bookmarkEnd w:id="28"/>
       <w:r>
         <w:rPr>
           <w:b w:val="1"/>
@@ -4881,798 +5901,1177 @@
     </w:p>
     <w:p>
       <w:pPr>
-        <w:keepNext w:val="0"/>
-        <w:keepLines w:val="0"/>
-        <w:pageBreakBefore w:val="0"/>
-        <w:widowControl w:val="1"/>
-        <w:pBdr>
-          <w:top w:space="0" w:sz="0" w:val="nil"/>
-          <w:left w:space="0" w:sz="0" w:val="nil"/>
-          <w:bottom w:space="0" w:sz="0" w:val="nil"/>
-          <w:right w:space="0" w:sz="0" w:val="nil"/>
-          <w:between w:space="0" w:sz="0" w:val="nil"/>
-        </w:pBdr>
-        <w:shd w:fill="auto" w:val="clear"/>
-        <w:spacing w:after="0" w:before="40" w:line="240" w:lineRule="auto"/>
-        <w:ind w:right="0"/>
-        <w:jc w:val="left"/>
-        <w:rPr/>
-      </w:pPr>
-      <w:r>
-        <w:rPr>
-          <w:rtl w:val="0"/>
-        </w:rPr>
-      </w:r>
-    </w:p>
-    <w:p>
-      <w:pPr>
-        <w:keepNext w:val="0"/>
-        <w:keepLines w:val="0"/>
-        <w:pageBreakBefore w:val="0"/>
-        <w:widowControl w:val="1"/>
-        <w:pBdr>
-          <w:top w:space="0" w:sz="0" w:val="nil"/>
-          <w:left w:space="0" w:sz="0" w:val="nil"/>
-          <w:bottom w:space="0" w:sz="0" w:val="nil"/>
-          <w:right w:space="0" w:sz="0" w:val="nil"/>
-          <w:between w:space="0" w:sz="0" w:val="nil"/>
-        </w:pBdr>
-        <w:shd w:fill="auto" w:val="clear"/>
-        <w:spacing w:after="0" w:before="40" w:line="240" w:lineRule="auto"/>
-        <w:ind w:right="0"/>
-        <w:jc w:val="left"/>
-        <w:rPr/>
-      </w:pPr>
-      <w:r>
-        <w:rPr>
-          <w:rtl w:val="0"/>
-        </w:rPr>
-      </w:r>
-    </w:p>
-    <w:p>
-      <w:pPr>
-        <w:keepNext w:val="0"/>
-        <w:keepLines w:val="0"/>
-        <w:pageBreakBefore w:val="0"/>
-        <w:widowControl w:val="1"/>
-        <w:pBdr>
-          <w:top w:space="0" w:sz="0" w:val="nil"/>
-          <w:left w:space="0" w:sz="0" w:val="nil"/>
-          <w:bottom w:space="0" w:sz="0" w:val="nil"/>
-          <w:right w:space="0" w:sz="0" w:val="nil"/>
-          <w:between w:space="0" w:sz="0" w:val="nil"/>
-        </w:pBdr>
-        <w:shd w:fill="auto" w:val="clear"/>
-        <w:spacing w:after="0" w:before="40" w:line="240" w:lineRule="auto"/>
-        <w:ind w:right="0"/>
-        <w:jc w:val="left"/>
-        <w:rPr/>
-      </w:pPr>
-      <w:r>
-        <w:rPr>
-          <w:rtl w:val="0"/>
-        </w:rPr>
-      </w:r>
-    </w:p>
-    <w:p>
-      <w:pPr>
-        <w:keepNext w:val="0"/>
-        <w:keepLines w:val="0"/>
-        <w:pageBreakBefore w:val="0"/>
-        <w:widowControl w:val="1"/>
-        <w:pBdr>
-          <w:top w:space="0" w:sz="0" w:val="nil"/>
-          <w:left w:space="0" w:sz="0" w:val="nil"/>
-          <w:bottom w:space="0" w:sz="0" w:val="nil"/>
-          <w:right w:space="0" w:sz="0" w:val="nil"/>
-          <w:between w:space="0" w:sz="0" w:val="nil"/>
-        </w:pBdr>
-        <w:shd w:fill="auto" w:val="clear"/>
-        <w:spacing w:after="0" w:before="40" w:line="240" w:lineRule="auto"/>
-        <w:ind w:right="0"/>
-        <w:jc w:val="left"/>
-        <w:rPr/>
-      </w:pPr>
-      <w:r>
-        <w:rPr>
-          <w:rtl w:val="0"/>
-        </w:rPr>
-      </w:r>
-    </w:p>
-    <w:p>
-      <w:pPr>
-        <w:keepNext w:val="0"/>
-        <w:keepLines w:val="0"/>
-        <w:pageBreakBefore w:val="0"/>
-        <w:widowControl w:val="1"/>
-        <w:pBdr>
-          <w:top w:space="0" w:sz="0" w:val="nil"/>
-          <w:left w:space="0" w:sz="0" w:val="nil"/>
-          <w:bottom w:space="0" w:sz="0" w:val="nil"/>
-          <w:right w:space="0" w:sz="0" w:val="nil"/>
-          <w:between w:space="0" w:sz="0" w:val="nil"/>
-        </w:pBdr>
-        <w:shd w:fill="auto" w:val="clear"/>
-        <w:spacing w:after="0" w:before="40" w:line="240" w:lineRule="auto"/>
-        <w:ind w:right="0"/>
-        <w:jc w:val="left"/>
-        <w:rPr/>
-      </w:pPr>
-      <w:r>
-        <w:rPr>
-          <w:rtl w:val="0"/>
-        </w:rPr>
-      </w:r>
-    </w:p>
-    <w:p>
-      <w:pPr>
-        <w:keepNext w:val="0"/>
-        <w:keepLines w:val="0"/>
-        <w:pageBreakBefore w:val="0"/>
-        <w:widowControl w:val="1"/>
-        <w:pBdr>
-          <w:top w:space="0" w:sz="0" w:val="nil"/>
-          <w:left w:space="0" w:sz="0" w:val="nil"/>
-          <w:bottom w:space="0" w:sz="0" w:val="nil"/>
-          <w:right w:space="0" w:sz="0" w:val="nil"/>
-          <w:between w:space="0" w:sz="0" w:val="nil"/>
-        </w:pBdr>
-        <w:shd w:fill="auto" w:val="clear"/>
-        <w:spacing w:after="0" w:before="40" w:line="240" w:lineRule="auto"/>
-        <w:ind w:right="0"/>
-        <w:jc w:val="left"/>
-        <w:rPr/>
-      </w:pPr>
-      <w:r>
-        <w:rPr>
-          <w:rtl w:val="0"/>
-        </w:rPr>
-      </w:r>
-    </w:p>
-    <w:p>
-      <w:pPr>
-        <w:keepNext w:val="0"/>
-        <w:keepLines w:val="0"/>
-        <w:pageBreakBefore w:val="0"/>
-        <w:widowControl w:val="1"/>
-        <w:pBdr>
-          <w:top w:space="0" w:sz="0" w:val="nil"/>
-          <w:left w:space="0" w:sz="0" w:val="nil"/>
-          <w:bottom w:space="0" w:sz="0" w:val="nil"/>
-          <w:right w:space="0" w:sz="0" w:val="nil"/>
-          <w:between w:space="0" w:sz="0" w:val="nil"/>
-        </w:pBdr>
-        <w:shd w:fill="auto" w:val="clear"/>
-        <w:spacing w:after="0" w:before="40" w:line="240" w:lineRule="auto"/>
-        <w:ind w:right="0"/>
-        <w:jc w:val="left"/>
-        <w:rPr/>
-      </w:pPr>
-      <w:r>
-        <w:rPr>
-          <w:rtl w:val="0"/>
-        </w:rPr>
-      </w:r>
-    </w:p>
-    <w:p>
-      <w:pPr>
-        <w:keepNext w:val="0"/>
-        <w:keepLines w:val="0"/>
-        <w:pageBreakBefore w:val="0"/>
-        <w:widowControl w:val="1"/>
-        <w:pBdr>
-          <w:top w:space="0" w:sz="0" w:val="nil"/>
-          <w:left w:space="0" w:sz="0" w:val="nil"/>
-          <w:bottom w:space="0" w:sz="0" w:val="nil"/>
-          <w:right w:space="0" w:sz="0" w:val="nil"/>
-          <w:between w:space="0" w:sz="0" w:val="nil"/>
-        </w:pBdr>
-        <w:shd w:fill="auto" w:val="clear"/>
-        <w:spacing w:after="0" w:before="40" w:line="240" w:lineRule="auto"/>
-        <w:ind w:right="0"/>
-        <w:jc w:val="left"/>
-        <w:rPr/>
-      </w:pPr>
-      <w:r>
-        <w:rPr>
-          <w:rtl w:val="0"/>
-        </w:rPr>
-      </w:r>
-    </w:p>
-    <w:p>
-      <w:pPr>
-        <w:keepNext w:val="0"/>
-        <w:keepLines w:val="0"/>
-        <w:pageBreakBefore w:val="0"/>
-        <w:widowControl w:val="1"/>
-        <w:pBdr>
-          <w:top w:space="0" w:sz="0" w:val="nil"/>
-          <w:left w:space="0" w:sz="0" w:val="nil"/>
-          <w:bottom w:space="0" w:sz="0" w:val="nil"/>
-          <w:right w:space="0" w:sz="0" w:val="nil"/>
-          <w:between w:space="0" w:sz="0" w:val="nil"/>
-        </w:pBdr>
-        <w:shd w:fill="auto" w:val="clear"/>
-        <w:spacing w:after="0" w:before="40" w:line="240" w:lineRule="auto"/>
-        <w:ind w:right="0"/>
-        <w:jc w:val="left"/>
-        <w:rPr/>
-      </w:pPr>
-      <w:r>
-        <w:rPr>
-          <w:rtl w:val="0"/>
-        </w:rPr>
-      </w:r>
-    </w:p>
-    <w:p>
-      <w:pPr>
-        <w:keepNext w:val="0"/>
-        <w:keepLines w:val="0"/>
-        <w:pageBreakBefore w:val="0"/>
-        <w:widowControl w:val="1"/>
-        <w:pBdr>
-          <w:top w:space="0" w:sz="0" w:val="nil"/>
-          <w:left w:space="0" w:sz="0" w:val="nil"/>
-          <w:bottom w:space="0" w:sz="0" w:val="nil"/>
-          <w:right w:space="0" w:sz="0" w:val="nil"/>
-          <w:between w:space="0" w:sz="0" w:val="nil"/>
-        </w:pBdr>
-        <w:shd w:fill="auto" w:val="clear"/>
-        <w:spacing w:after="0" w:before="40" w:line="240" w:lineRule="auto"/>
-        <w:ind w:right="0"/>
-        <w:jc w:val="left"/>
-        <w:rPr/>
-      </w:pPr>
-      <w:r>
-        <w:rPr>
-          <w:rtl w:val="0"/>
-        </w:rPr>
-      </w:r>
-    </w:p>
-    <w:p>
-      <w:pPr>
-        <w:keepNext w:val="0"/>
-        <w:keepLines w:val="0"/>
-        <w:pageBreakBefore w:val="0"/>
-        <w:widowControl w:val="1"/>
-        <w:pBdr>
-          <w:top w:space="0" w:sz="0" w:val="nil"/>
-          <w:left w:space="0" w:sz="0" w:val="nil"/>
-          <w:bottom w:space="0" w:sz="0" w:val="nil"/>
-          <w:right w:space="0" w:sz="0" w:val="nil"/>
-          <w:between w:space="0" w:sz="0" w:val="nil"/>
-        </w:pBdr>
-        <w:shd w:fill="auto" w:val="clear"/>
-        <w:spacing w:after="0" w:before="40" w:line="240" w:lineRule="auto"/>
-        <w:ind w:right="0"/>
-        <w:jc w:val="left"/>
-        <w:rPr/>
-      </w:pPr>
-      <w:r>
-        <w:rPr>
-          <w:rtl w:val="0"/>
-        </w:rPr>
-      </w:r>
-    </w:p>
-    <w:p>
-      <w:pPr>
-        <w:keepNext w:val="0"/>
-        <w:keepLines w:val="0"/>
-        <w:pageBreakBefore w:val="0"/>
-        <w:widowControl w:val="1"/>
-        <w:pBdr>
-          <w:top w:space="0" w:sz="0" w:val="nil"/>
-          <w:left w:space="0" w:sz="0" w:val="nil"/>
-          <w:bottom w:space="0" w:sz="0" w:val="nil"/>
-          <w:right w:space="0" w:sz="0" w:val="nil"/>
-          <w:between w:space="0" w:sz="0" w:val="nil"/>
-        </w:pBdr>
-        <w:shd w:fill="auto" w:val="clear"/>
-        <w:spacing w:after="0" w:before="40" w:line="240" w:lineRule="auto"/>
-        <w:ind w:right="0"/>
-        <w:jc w:val="left"/>
-        <w:rPr/>
-      </w:pPr>
-      <w:r>
-        <w:rPr>
-          <w:rtl w:val="0"/>
-        </w:rPr>
-      </w:r>
-    </w:p>
-    <w:p>
-      <w:pPr>
-        <w:keepNext w:val="0"/>
-        <w:keepLines w:val="0"/>
-        <w:pageBreakBefore w:val="0"/>
-        <w:widowControl w:val="1"/>
-        <w:pBdr>
-          <w:top w:space="0" w:sz="0" w:val="nil"/>
-          <w:left w:space="0" w:sz="0" w:val="nil"/>
-          <w:bottom w:space="0" w:sz="0" w:val="nil"/>
-          <w:right w:space="0" w:sz="0" w:val="nil"/>
-          <w:between w:space="0" w:sz="0" w:val="nil"/>
-        </w:pBdr>
-        <w:shd w:fill="auto" w:val="clear"/>
-        <w:spacing w:after="0" w:before="40" w:line="240" w:lineRule="auto"/>
-        <w:ind w:right="0"/>
-        <w:jc w:val="left"/>
-        <w:rPr/>
-      </w:pPr>
-      <w:r>
-        <w:rPr>
-          <w:rtl w:val="0"/>
-        </w:rPr>
-      </w:r>
-    </w:p>
-    <w:p>
-      <w:pPr>
-        <w:keepNext w:val="0"/>
-        <w:keepLines w:val="0"/>
-        <w:pageBreakBefore w:val="0"/>
-        <w:widowControl w:val="1"/>
-        <w:pBdr>
-          <w:top w:space="0" w:sz="0" w:val="nil"/>
-          <w:left w:space="0" w:sz="0" w:val="nil"/>
-          <w:bottom w:space="0" w:sz="0" w:val="nil"/>
-          <w:right w:space="0" w:sz="0" w:val="nil"/>
-          <w:between w:space="0" w:sz="0" w:val="nil"/>
-        </w:pBdr>
-        <w:shd w:fill="auto" w:val="clear"/>
-        <w:spacing w:after="0" w:before="40" w:line="240" w:lineRule="auto"/>
-        <w:ind w:right="0"/>
-        <w:jc w:val="left"/>
-        <w:rPr/>
-      </w:pPr>
-      <w:r>
-        <w:rPr>
-          <w:rtl w:val="0"/>
-        </w:rPr>
-      </w:r>
-    </w:p>
-    <w:p>
-      <w:pPr>
-        <w:keepNext w:val="0"/>
-        <w:keepLines w:val="0"/>
-        <w:pageBreakBefore w:val="0"/>
-        <w:widowControl w:val="1"/>
-        <w:pBdr>
-          <w:top w:space="0" w:sz="0" w:val="nil"/>
-          <w:left w:space="0" w:sz="0" w:val="nil"/>
-          <w:bottom w:space="0" w:sz="0" w:val="nil"/>
-          <w:right w:space="0" w:sz="0" w:val="nil"/>
-          <w:between w:space="0" w:sz="0" w:val="nil"/>
-        </w:pBdr>
-        <w:shd w:fill="auto" w:val="clear"/>
-        <w:spacing w:after="0" w:before="40" w:line="240" w:lineRule="auto"/>
-        <w:ind w:right="0"/>
-        <w:jc w:val="left"/>
-        <w:rPr/>
-      </w:pPr>
-      <w:r>
-        <w:rPr>
-          <w:rtl w:val="0"/>
-        </w:rPr>
-      </w:r>
-    </w:p>
-    <w:p>
-      <w:pPr>
-        <w:keepNext w:val="0"/>
-        <w:keepLines w:val="0"/>
-        <w:pageBreakBefore w:val="0"/>
-        <w:widowControl w:val="1"/>
-        <w:pBdr>
-          <w:top w:space="0" w:sz="0" w:val="nil"/>
-          <w:left w:space="0" w:sz="0" w:val="nil"/>
-          <w:bottom w:space="0" w:sz="0" w:val="nil"/>
-          <w:right w:space="0" w:sz="0" w:val="nil"/>
-          <w:between w:space="0" w:sz="0" w:val="nil"/>
-        </w:pBdr>
-        <w:shd w:fill="auto" w:val="clear"/>
-        <w:spacing w:after="0" w:before="40" w:line="240" w:lineRule="auto"/>
-        <w:ind w:right="0"/>
-        <w:jc w:val="left"/>
-        <w:rPr/>
-      </w:pPr>
-      <w:r>
-        <w:rPr>
-          <w:rtl w:val="0"/>
-        </w:rPr>
-      </w:r>
-    </w:p>
-    <w:p>
-      <w:pPr>
-        <w:keepNext w:val="0"/>
-        <w:keepLines w:val="0"/>
-        <w:pageBreakBefore w:val="0"/>
-        <w:widowControl w:val="1"/>
-        <w:pBdr>
-          <w:top w:space="0" w:sz="0" w:val="nil"/>
-          <w:left w:space="0" w:sz="0" w:val="nil"/>
-          <w:bottom w:space="0" w:sz="0" w:val="nil"/>
-          <w:right w:space="0" w:sz="0" w:val="nil"/>
-          <w:between w:space="0" w:sz="0" w:val="nil"/>
-        </w:pBdr>
-        <w:shd w:fill="auto" w:val="clear"/>
-        <w:spacing w:after="0" w:before="40" w:line="240" w:lineRule="auto"/>
-        <w:ind w:right="0"/>
-        <w:jc w:val="left"/>
-        <w:rPr/>
-      </w:pPr>
-      <w:r>
-        <w:rPr>
-          <w:rtl w:val="0"/>
-        </w:rPr>
-      </w:r>
-    </w:p>
-    <w:p>
-      <w:pPr>
-        <w:keepNext w:val="0"/>
-        <w:keepLines w:val="0"/>
-        <w:pageBreakBefore w:val="0"/>
-        <w:widowControl w:val="1"/>
-        <w:pBdr>
-          <w:top w:space="0" w:sz="0" w:val="nil"/>
-          <w:left w:space="0" w:sz="0" w:val="nil"/>
-          <w:bottom w:space="0" w:sz="0" w:val="nil"/>
-          <w:right w:space="0" w:sz="0" w:val="nil"/>
-          <w:between w:space="0" w:sz="0" w:val="nil"/>
-        </w:pBdr>
-        <w:shd w:fill="auto" w:val="clear"/>
-        <w:spacing w:after="0" w:before="40" w:line="240" w:lineRule="auto"/>
-        <w:ind w:right="0"/>
-        <w:jc w:val="left"/>
-        <w:rPr/>
-      </w:pPr>
-      <w:r>
-        <w:rPr>
-          <w:rtl w:val="0"/>
-        </w:rPr>
-      </w:r>
-    </w:p>
-    <w:p>
-      <w:pPr>
-        <w:keepNext w:val="0"/>
-        <w:keepLines w:val="0"/>
-        <w:pageBreakBefore w:val="0"/>
-        <w:widowControl w:val="1"/>
-        <w:pBdr>
-          <w:top w:space="0" w:sz="0" w:val="nil"/>
-          <w:left w:space="0" w:sz="0" w:val="nil"/>
-          <w:bottom w:space="0" w:sz="0" w:val="nil"/>
-          <w:right w:space="0" w:sz="0" w:val="nil"/>
-          <w:between w:space="0" w:sz="0" w:val="nil"/>
-        </w:pBdr>
-        <w:shd w:fill="auto" w:val="clear"/>
-        <w:spacing w:after="0" w:before="40" w:line="240" w:lineRule="auto"/>
-        <w:ind w:right="0"/>
-        <w:jc w:val="left"/>
-        <w:rPr/>
-      </w:pPr>
-      <w:r>
-        <w:rPr>
-          <w:rtl w:val="0"/>
-        </w:rPr>
-      </w:r>
-    </w:p>
-    <w:p>
-      <w:pPr>
-        <w:keepNext w:val="0"/>
-        <w:keepLines w:val="0"/>
-        <w:pageBreakBefore w:val="0"/>
-        <w:widowControl w:val="1"/>
-        <w:pBdr>
-          <w:top w:space="0" w:sz="0" w:val="nil"/>
-          <w:left w:space="0" w:sz="0" w:val="nil"/>
-          <w:bottom w:space="0" w:sz="0" w:val="nil"/>
-          <w:right w:space="0" w:sz="0" w:val="nil"/>
-          <w:between w:space="0" w:sz="0" w:val="nil"/>
-        </w:pBdr>
-        <w:shd w:fill="auto" w:val="clear"/>
-        <w:spacing w:after="0" w:before="40" w:line="240" w:lineRule="auto"/>
-        <w:ind w:right="0"/>
-        <w:jc w:val="left"/>
-        <w:rPr/>
-      </w:pPr>
-      <w:r>
-        <w:rPr>
-          <w:rtl w:val="0"/>
-        </w:rPr>
-      </w:r>
-    </w:p>
-    <w:p>
-      <w:pPr>
-        <w:keepNext w:val="0"/>
-        <w:keepLines w:val="0"/>
-        <w:pageBreakBefore w:val="0"/>
-        <w:widowControl w:val="1"/>
-        <w:pBdr>
-          <w:top w:space="0" w:sz="0" w:val="nil"/>
-          <w:left w:space="0" w:sz="0" w:val="nil"/>
-          <w:bottom w:space="0" w:sz="0" w:val="nil"/>
-          <w:right w:space="0" w:sz="0" w:val="nil"/>
-          <w:between w:space="0" w:sz="0" w:val="nil"/>
-        </w:pBdr>
-        <w:shd w:fill="auto" w:val="clear"/>
-        <w:spacing w:after="0" w:before="40" w:line="240" w:lineRule="auto"/>
-        <w:ind w:right="0"/>
-        <w:jc w:val="left"/>
-        <w:rPr/>
-      </w:pPr>
-      <w:r>
-        <w:rPr>
-          <w:rtl w:val="0"/>
-        </w:rPr>
-      </w:r>
-    </w:p>
-    <w:p>
-      <w:pPr>
-        <w:keepNext w:val="0"/>
-        <w:keepLines w:val="0"/>
-        <w:pageBreakBefore w:val="0"/>
-        <w:widowControl w:val="1"/>
-        <w:pBdr>
-          <w:top w:space="0" w:sz="0" w:val="nil"/>
-          <w:left w:space="0" w:sz="0" w:val="nil"/>
-          <w:bottom w:space="0" w:sz="0" w:val="nil"/>
-          <w:right w:space="0" w:sz="0" w:val="nil"/>
-          <w:between w:space="0" w:sz="0" w:val="nil"/>
-        </w:pBdr>
-        <w:shd w:fill="auto" w:val="clear"/>
-        <w:spacing w:after="0" w:before="40" w:line="240" w:lineRule="auto"/>
-        <w:ind w:right="0"/>
-        <w:jc w:val="left"/>
-        <w:rPr/>
-      </w:pPr>
-      <w:r>
-        <w:rPr>
-          <w:rtl w:val="0"/>
-        </w:rPr>
-      </w:r>
-    </w:p>
-    <w:p>
-      <w:pPr>
-        <w:keepNext w:val="0"/>
-        <w:keepLines w:val="0"/>
-        <w:pageBreakBefore w:val="0"/>
-        <w:widowControl w:val="1"/>
-        <w:pBdr>
-          <w:top w:space="0" w:sz="0" w:val="nil"/>
-          <w:left w:space="0" w:sz="0" w:val="nil"/>
-          <w:bottom w:space="0" w:sz="0" w:val="nil"/>
-          <w:right w:space="0" w:sz="0" w:val="nil"/>
-          <w:between w:space="0" w:sz="0" w:val="nil"/>
-        </w:pBdr>
-        <w:shd w:fill="auto" w:val="clear"/>
-        <w:spacing w:after="0" w:before="40" w:line="240" w:lineRule="auto"/>
-        <w:ind w:right="0"/>
-        <w:jc w:val="left"/>
-        <w:rPr/>
-      </w:pPr>
-      <w:r>
-        <w:rPr>
-          <w:rtl w:val="0"/>
-        </w:rPr>
-      </w:r>
-    </w:p>
-    <w:p>
-      <w:pPr>
-        <w:keepNext w:val="0"/>
-        <w:keepLines w:val="0"/>
-        <w:pageBreakBefore w:val="0"/>
-        <w:widowControl w:val="1"/>
-        <w:pBdr>
-          <w:top w:space="0" w:sz="0" w:val="nil"/>
-          <w:left w:space="0" w:sz="0" w:val="nil"/>
-          <w:bottom w:space="0" w:sz="0" w:val="nil"/>
-          <w:right w:space="0" w:sz="0" w:val="nil"/>
-          <w:between w:space="0" w:sz="0" w:val="nil"/>
-        </w:pBdr>
-        <w:shd w:fill="auto" w:val="clear"/>
-        <w:spacing w:after="0" w:before="40" w:line="240" w:lineRule="auto"/>
-        <w:ind w:right="0"/>
-        <w:jc w:val="left"/>
-        <w:rPr/>
-      </w:pPr>
-      <w:r>
-        <w:rPr>
-          <w:rtl w:val="0"/>
-        </w:rPr>
-      </w:r>
-    </w:p>
-    <w:p>
-      <w:pPr>
-        <w:keepNext w:val="0"/>
-        <w:keepLines w:val="0"/>
-        <w:pageBreakBefore w:val="0"/>
-        <w:widowControl w:val="1"/>
-        <w:pBdr>
-          <w:top w:space="0" w:sz="0" w:val="nil"/>
-          <w:left w:space="0" w:sz="0" w:val="nil"/>
-          <w:bottom w:space="0" w:sz="0" w:val="nil"/>
-          <w:right w:space="0" w:sz="0" w:val="nil"/>
-          <w:between w:space="0" w:sz="0" w:val="nil"/>
-        </w:pBdr>
-        <w:shd w:fill="auto" w:val="clear"/>
-        <w:spacing w:after="0" w:before="40" w:line="240" w:lineRule="auto"/>
-        <w:ind w:right="0"/>
-        <w:jc w:val="left"/>
-        <w:rPr/>
-      </w:pPr>
-      <w:r>
-        <w:rPr>
-          <w:rtl w:val="0"/>
-        </w:rPr>
-      </w:r>
-    </w:p>
-    <w:p>
-      <w:pPr>
-        <w:keepNext w:val="0"/>
-        <w:keepLines w:val="0"/>
-        <w:pageBreakBefore w:val="0"/>
-        <w:widowControl w:val="1"/>
-        <w:pBdr>
-          <w:top w:space="0" w:sz="0" w:val="nil"/>
-          <w:left w:space="0" w:sz="0" w:val="nil"/>
-          <w:bottom w:space="0" w:sz="0" w:val="nil"/>
-          <w:right w:space="0" w:sz="0" w:val="nil"/>
-          <w:between w:space="0" w:sz="0" w:val="nil"/>
-        </w:pBdr>
-        <w:shd w:fill="auto" w:val="clear"/>
-        <w:spacing w:after="0" w:before="40" w:line="240" w:lineRule="auto"/>
-        <w:ind w:right="0"/>
-        <w:jc w:val="left"/>
-        <w:rPr/>
-      </w:pPr>
-      <w:r>
-        <w:rPr>
-          <w:rtl w:val="0"/>
-        </w:rPr>
-      </w:r>
-    </w:p>
-    <w:p>
-      <w:pPr>
-        <w:keepNext w:val="0"/>
-        <w:keepLines w:val="0"/>
-        <w:pageBreakBefore w:val="0"/>
-        <w:widowControl w:val="1"/>
-        <w:pBdr>
-          <w:top w:space="0" w:sz="0" w:val="nil"/>
-          <w:left w:space="0" w:sz="0" w:val="nil"/>
-          <w:bottom w:space="0" w:sz="0" w:val="nil"/>
-          <w:right w:space="0" w:sz="0" w:val="nil"/>
-          <w:between w:space="0" w:sz="0" w:val="nil"/>
-        </w:pBdr>
-        <w:shd w:fill="auto" w:val="clear"/>
-        <w:spacing w:after="0" w:before="40" w:line="240" w:lineRule="auto"/>
-        <w:ind w:right="0"/>
-        <w:jc w:val="left"/>
-        <w:rPr/>
-      </w:pPr>
-      <w:r>
-        <w:rPr>
-          <w:rtl w:val="0"/>
-        </w:rPr>
-      </w:r>
-    </w:p>
-    <w:p>
-      <w:pPr>
-        <w:keepNext w:val="0"/>
-        <w:keepLines w:val="0"/>
-        <w:pageBreakBefore w:val="0"/>
-        <w:widowControl w:val="1"/>
-        <w:pBdr>
-          <w:top w:space="0" w:sz="0" w:val="nil"/>
-          <w:left w:space="0" w:sz="0" w:val="nil"/>
-          <w:bottom w:space="0" w:sz="0" w:val="nil"/>
-          <w:right w:space="0" w:sz="0" w:val="nil"/>
-          <w:between w:space="0" w:sz="0" w:val="nil"/>
-        </w:pBdr>
-        <w:shd w:fill="auto" w:val="clear"/>
-        <w:spacing w:after="0" w:before="40" w:line="240" w:lineRule="auto"/>
-        <w:ind w:right="0"/>
-        <w:jc w:val="left"/>
-        <w:rPr/>
-      </w:pPr>
-      <w:r>
-        <w:rPr>
-          <w:rtl w:val="0"/>
-        </w:rPr>
-      </w:r>
-    </w:p>
-    <w:p>
-      <w:pPr>
-        <w:keepNext w:val="0"/>
-        <w:keepLines w:val="0"/>
-        <w:pageBreakBefore w:val="0"/>
-        <w:widowControl w:val="1"/>
-        <w:pBdr>
-          <w:top w:space="0" w:sz="0" w:val="nil"/>
-          <w:left w:space="0" w:sz="0" w:val="nil"/>
-          <w:bottom w:space="0" w:sz="0" w:val="nil"/>
-          <w:right w:space="0" w:sz="0" w:val="nil"/>
-          <w:between w:space="0" w:sz="0" w:val="nil"/>
-        </w:pBdr>
-        <w:shd w:fill="auto" w:val="clear"/>
-        <w:spacing w:after="0" w:before="40" w:line="240" w:lineRule="auto"/>
-        <w:ind w:right="0"/>
-        <w:jc w:val="left"/>
-        <w:rPr/>
-      </w:pPr>
-      <w:r>
-        <w:rPr>
-          <w:rtl w:val="0"/>
-        </w:rPr>
-      </w:r>
-    </w:p>
-    <w:p>
-      <w:pPr>
-        <w:keepNext w:val="0"/>
-        <w:keepLines w:val="0"/>
-        <w:pageBreakBefore w:val="0"/>
-        <w:widowControl w:val="1"/>
-        <w:pBdr>
-          <w:top w:space="0" w:sz="0" w:val="nil"/>
-          <w:left w:space="0" w:sz="0" w:val="nil"/>
-          <w:bottom w:space="0" w:sz="0" w:val="nil"/>
-          <w:right w:space="0" w:sz="0" w:val="nil"/>
-          <w:between w:space="0" w:sz="0" w:val="nil"/>
-        </w:pBdr>
-        <w:shd w:fill="auto" w:val="clear"/>
-        <w:spacing w:after="0" w:before="40" w:line="240" w:lineRule="auto"/>
-        <w:ind w:right="0"/>
-        <w:jc w:val="left"/>
-        <w:rPr/>
-      </w:pPr>
-      <w:r>
-        <w:rPr>
-          <w:rtl w:val="0"/>
-        </w:rPr>
-      </w:r>
-    </w:p>
-    <w:p>
-      <w:pPr>
-        <w:keepNext w:val="0"/>
-        <w:keepLines w:val="0"/>
-        <w:pageBreakBefore w:val="0"/>
-        <w:widowControl w:val="1"/>
-        <w:pBdr>
-          <w:top w:space="0" w:sz="0" w:val="nil"/>
-          <w:left w:space="0" w:sz="0" w:val="nil"/>
-          <w:bottom w:space="0" w:sz="0" w:val="nil"/>
-          <w:right w:space="0" w:sz="0" w:val="nil"/>
-          <w:between w:space="0" w:sz="0" w:val="nil"/>
-        </w:pBdr>
-        <w:shd w:fill="auto" w:val="clear"/>
-        <w:spacing w:after="0" w:before="40" w:line="240" w:lineRule="auto"/>
-        <w:ind w:right="0"/>
-        <w:jc w:val="left"/>
-        <w:rPr/>
-      </w:pPr>
-      <w:r>
-        <w:rPr>
-          <w:rtl w:val="0"/>
-        </w:rPr>
-      </w:r>
-    </w:p>
-    <w:p>
-      <w:pPr>
-        <w:keepNext w:val="0"/>
-        <w:keepLines w:val="0"/>
-        <w:pageBreakBefore w:val="0"/>
-        <w:widowControl w:val="1"/>
-        <w:pBdr>
-          <w:top w:space="0" w:sz="0" w:val="nil"/>
-          <w:left w:space="0" w:sz="0" w:val="nil"/>
-          <w:bottom w:space="0" w:sz="0" w:val="nil"/>
-          <w:right w:space="0" w:sz="0" w:val="nil"/>
-          <w:between w:space="0" w:sz="0" w:val="nil"/>
-        </w:pBdr>
-        <w:shd w:fill="auto" w:val="clear"/>
-        <w:spacing w:after="0" w:before="40" w:line="240" w:lineRule="auto"/>
-        <w:ind w:right="0"/>
-        <w:jc w:val="left"/>
-        <w:rPr/>
-      </w:pPr>
+        <w:rPr/>
+      </w:pPr>
+      <w:r>
+        <w:pict>
+          <v:rect style="width:0.0pt;height:1.5pt" o:hr="t" o:hrstd="t" o:hralign="center" fillcolor="#A0A0A0" stroked="f"/>
+        </w:pict>
+      </w:r>
+      <w:r>
+        <w:rPr>
+          <w:rtl w:val="0"/>
+        </w:rPr>
+      </w:r>
+    </w:p>
+    <w:p>
+      <w:pPr>
+        <w:rPr/>
+      </w:pPr>
+      <w:r>
+        <w:rPr>
+          <w:rtl w:val="0"/>
+        </w:rPr>
+      </w:r>
+    </w:p>
+    <w:p>
+      <w:pPr>
+        <w:spacing w:before="40" w:line="240" w:lineRule="auto"/>
+        <w:jc w:val="left"/>
+        <w:rPr>
+          <w:b w:val="1"/>
+        </w:rPr>
+      </w:pPr>
+      <w:r>
+        <w:rPr>
+          <w:b w:val="1"/>
+          <w:rtl w:val="0"/>
+        </w:rPr>
+        <w:t xml:space="preserve">Taula d’ajuda</w:t>
+      </w:r>
+    </w:p>
+    <w:p>
+      <w:pPr>
+        <w:spacing w:before="40" w:line="240" w:lineRule="auto"/>
+        <w:jc w:val="left"/>
+        <w:rPr>
+          <w:b w:val="1"/>
+        </w:rPr>
+      </w:pPr>
+      <w:r>
+        <w:rPr>
+          <w:rtl w:val="0"/>
+        </w:rPr>
+      </w:r>
+    </w:p>
+    <w:p>
+      <w:pPr>
+        <w:spacing w:before="40" w:line="240" w:lineRule="auto"/>
+        <w:jc w:val="left"/>
+        <w:rPr/>
+      </w:pPr>
+      <w:r>
+        <w:rPr>
+          <w:rtl w:val="0"/>
+        </w:rPr>
+        <w:t xml:space="preserve">Empleneu aquesta taula i penseu com reforçar els arguments que us </w:t>
+      </w:r>
+      <w:r>
+        <w:rPr>
+          <w:b w:val="1"/>
+          <w:color w:val="38761d"/>
+          <w:rtl w:val="0"/>
+        </w:rPr>
+        <w:t xml:space="preserve">beneficien </w:t>
+      </w:r>
+      <w:r>
+        <w:rPr>
+          <w:rtl w:val="0"/>
+        </w:rPr>
+        <w:t xml:space="preserve">i rebatre els arguments que us </w:t>
+      </w:r>
+      <w:r>
+        <w:rPr>
+          <w:b w:val="1"/>
+          <w:color w:val="980000"/>
+          <w:rtl w:val="0"/>
+        </w:rPr>
+        <w:t xml:space="preserve">perjudiquen</w:t>
+      </w:r>
+      <w:r>
+        <w:rPr>
+          <w:rtl w:val="0"/>
+        </w:rPr>
+        <w:t xml:space="preserve">.</w:t>
+      </w:r>
+    </w:p>
+    <w:p>
+      <w:pPr>
+        <w:keepNext w:val="0"/>
+        <w:keepLines w:val="0"/>
+        <w:pageBreakBefore w:val="0"/>
+        <w:widowControl w:val="1"/>
+        <w:pBdr>
+          <w:top w:space="0" w:sz="0" w:val="nil"/>
+          <w:left w:space="0" w:sz="0" w:val="nil"/>
+          <w:bottom w:space="0" w:sz="0" w:val="nil"/>
+          <w:right w:space="0" w:sz="0" w:val="nil"/>
+          <w:between w:space="0" w:sz="0" w:val="nil"/>
+        </w:pBdr>
+        <w:shd w:fill="auto" w:val="clear"/>
+        <w:spacing w:after="0" w:before="40" w:line="240" w:lineRule="auto"/>
+        <w:ind w:right="0"/>
+        <w:jc w:val="left"/>
+        <w:rPr/>
+      </w:pPr>
+      <w:r>
+        <w:rPr>
+          <w:rtl w:val="0"/>
+        </w:rPr>
+      </w:r>
+    </w:p>
+    <w:p>
+      <w:pPr>
+        <w:keepNext w:val="0"/>
+        <w:keepLines w:val="0"/>
+        <w:pageBreakBefore w:val="0"/>
+        <w:widowControl w:val="1"/>
+        <w:pBdr>
+          <w:top w:space="0" w:sz="0" w:val="nil"/>
+          <w:left w:space="0" w:sz="0" w:val="nil"/>
+          <w:bottom w:space="0" w:sz="0" w:val="nil"/>
+          <w:right w:space="0" w:sz="0" w:val="nil"/>
+          <w:between w:space="0" w:sz="0" w:val="nil"/>
+        </w:pBdr>
+        <w:shd w:fill="auto" w:val="clear"/>
+        <w:spacing w:after="0" w:before="40" w:line="240" w:lineRule="auto"/>
+        <w:ind w:right="0"/>
+        <w:jc w:val="left"/>
+        <w:rPr/>
+      </w:pPr>
+      <w:r>
+        <w:rPr>
+          <w:rtl w:val="0"/>
+        </w:rPr>
+      </w:r>
+      <w:r>
+        <mc:AlternateContent>
+          <mc:Choice Requires="wpg">
+            <w:drawing>
+              <wp:anchor allowOverlap="1" behindDoc="0" distB="114300" distT="114300" distL="114300" distR="114300" hidden="0" layoutInCell="1" locked="0" relativeHeight="0" simplePos="0">
+                <wp:simplePos x="0" y="0"/>
+                <wp:positionH relativeFrom="column">
+                  <wp:posOffset>114300</wp:posOffset>
+                </wp:positionH>
+                <wp:positionV relativeFrom="paragraph">
+                  <wp:posOffset>139700</wp:posOffset>
+                </wp:positionV>
+                <wp:extent cx="5157788" cy="4521437"/>
+                <wp:effectExtent b="0" l="0" r="0" t="0"/>
+                <wp:wrapSquare wrapText="bothSides" distB="114300" distT="114300" distL="114300" distR="114300"/>
+                <wp:docPr id="3" name=""/>
+                <a:graphic>
+                  <a:graphicData uri="http://schemas.microsoft.com/office/word/2010/wordprocessingGroup">
+                    <wpg:wgp>
+                      <wpg:cNvGrpSpPr/>
+                      <wpg:grpSpPr>
+                        <a:xfrm>
+                          <a:off x="292450" y="580575"/>
+                          <a:ext cx="5157788" cy="4521437"/>
+                          <a:chOff x="292450" y="580575"/>
+                          <a:chExt cx="5852825" cy="5134425"/>
+                        </a:xfrm>
+                      </wpg:grpSpPr>
+                      <wps:wsp>
+                        <wps:cNvCnPr/>
+                        <wps:spPr>
+                          <a:xfrm>
+                            <a:off x="3117662" y="580625"/>
+                            <a:ext cx="18900" cy="5450400"/>
+                          </a:xfrm>
+                          <a:prstGeom prst="straightConnector1">
+                            <a:avLst/>
+                          </a:prstGeom>
+                          <a:noFill/>
+                          <a:ln cap="flat" cmpd="sng" w="19050">
+                            <a:solidFill>
+                              <a:srgbClr val="000000"/>
+                            </a:solidFill>
+                            <a:prstDash val="solid"/>
+                            <a:round/>
+                            <a:headEnd len="med" w="med" type="none"/>
+                            <a:tailEnd len="med" w="med" type="none"/>
+                          </a:ln>
+                        </wps:spPr>
+                        <wps:bodyPr anchorCtr="0" anchor="ctr" bIns="168125" lIns="168125" spcFirstLastPara="1" rIns="168125" wrap="square" tIns="168125">
+                          <a:noAutofit/>
+                        </wps:bodyPr>
+                      </wps:wsp>
+                      <wps:wsp>
+                        <wps:cNvSpPr txBox="1"/>
+                        <wps:cNvPr id="3" name="Shape 3"/>
+                        <wps:spPr>
+                          <a:xfrm>
+                            <a:off x="292475" y="746775"/>
+                            <a:ext cx="3008700" cy="790500"/>
+                          </a:xfrm>
+                          <a:prstGeom prst="rect">
+                            <a:avLst/>
+                          </a:prstGeom>
+                          <a:noFill/>
+                          <a:ln>
+                            <a:noFill/>
+                          </a:ln>
+                        </wps:spPr>
+                        <wps:txbx>
+                          <w:txbxContent>
+                            <w:p>
+                              <w:pPr>
+                                <w:spacing w:after="0" w:before="0" w:line="240"/>
+                                <w:ind w:left="0" w:right="0" w:firstLine="0"/>
+                                <w:jc w:val="center"/>
+                                <w:textDirection w:val="btLr"/>
+                              </w:pPr>
+                              <w:r>
+                                <w:rPr>
+                                  <w:rFonts w:ascii="Montserrat" w:cs="Montserrat" w:eastAsia="Montserrat" w:hAnsi="Montserrat"/>
+                                  <w:b w:val="0"/>
+                                  <w:i w:val="0"/>
+                                  <w:smallCaps w:val="0"/>
+                                  <w:strike w:val="0"/>
+                                  <w:color w:val="000000"/>
+                                  <w:sz w:val="20"/>
+                                  <w:vertAlign w:val="baseline"/>
+                                </w:rPr>
+                                <w:t xml:space="preserve">Punts </w:t>
+                              </w:r>
+                              <w:r>
+                                <w:rPr>
+                                  <w:rFonts w:ascii="Montserrat" w:cs="Montserrat" w:eastAsia="Montserrat" w:hAnsi="Montserrat"/>
+                                  <w:b w:val="1"/>
+                                  <w:i w:val="0"/>
+                                  <w:smallCaps w:val="0"/>
+                                  <w:strike w:val="0"/>
+                                  <w:color w:val="38761d"/>
+                                  <w:sz w:val="20"/>
+                                  <w:vertAlign w:val="baseline"/>
+                                </w:rPr>
+                                <w:t xml:space="preserve">a favor</w:t>
+                              </w:r>
+                              <w:r>
+                                <w:rPr>
+                                  <w:rFonts w:ascii="Montserrat" w:cs="Montserrat" w:eastAsia="Montserrat" w:hAnsi="Montserrat"/>
+                                  <w:b w:val="0"/>
+                                  <w:i w:val="0"/>
+                                  <w:smallCaps w:val="0"/>
+                                  <w:strike w:val="0"/>
+                                  <w:color w:val="000000"/>
+                                  <w:sz w:val="20"/>
+                                  <w:vertAlign w:val="baseline"/>
+                                </w:rPr>
+                                <w:t xml:space="preserve"> del nostre punt de vista</w:t>
+                              </w:r>
+                            </w:p>
+                          </w:txbxContent>
+                        </wps:txbx>
+                        <wps:bodyPr anchorCtr="0" anchor="t" bIns="168125" lIns="168125" spcFirstLastPara="1" rIns="168125" wrap="square" tIns="168125">
+                          <a:noAutofit/>
+                        </wps:bodyPr>
+                      </wps:wsp>
+                      <wps:wsp>
+                        <wps:cNvSpPr txBox="1"/>
+                        <wps:cNvPr id="4" name="Shape 4"/>
+                        <wps:spPr>
+                          <a:xfrm>
+                            <a:off x="3136553" y="746776"/>
+                            <a:ext cx="3008700" cy="790500"/>
+                          </a:xfrm>
+                          <a:prstGeom prst="rect">
+                            <a:avLst/>
+                          </a:prstGeom>
+                          <a:noFill/>
+                          <a:ln>
+                            <a:noFill/>
+                          </a:ln>
+                        </wps:spPr>
+                        <wps:txbx>
+                          <w:txbxContent>
+                            <w:p>
+                              <w:pPr>
+                                <w:spacing w:after="0" w:before="0" w:line="240"/>
+                                <w:ind w:left="0" w:right="0" w:firstLine="0"/>
+                                <w:jc w:val="center"/>
+                                <w:textDirection w:val="btLr"/>
+                              </w:pPr>
+                              <w:r>
+                                <w:rPr>
+                                  <w:rFonts w:ascii="Montserrat" w:cs="Montserrat" w:eastAsia="Montserrat" w:hAnsi="Montserrat"/>
+                                  <w:b w:val="0"/>
+                                  <w:i w:val="0"/>
+                                  <w:smallCaps w:val="0"/>
+                                  <w:strike w:val="0"/>
+                                  <w:color w:val="000000"/>
+                                  <w:sz w:val="20"/>
+                                  <w:vertAlign w:val="baseline"/>
+                                </w:rPr>
+                                <w:t xml:space="preserve">Punts </w:t>
+                              </w:r>
+                              <w:r>
+                                <w:rPr>
+                                  <w:rFonts w:ascii="Montserrat" w:cs="Montserrat" w:eastAsia="Montserrat" w:hAnsi="Montserrat"/>
+                                  <w:b w:val="1"/>
+                                  <w:i w:val="0"/>
+                                  <w:smallCaps w:val="0"/>
+                                  <w:strike w:val="0"/>
+                                  <w:color w:val="980000"/>
+                                  <w:sz w:val="20"/>
+                                  <w:vertAlign w:val="baseline"/>
+                                </w:rPr>
+                                <w:t xml:space="preserve">en contra </w:t>
+                              </w:r>
+                              <w:r>
+                                <w:rPr>
+                                  <w:rFonts w:ascii="Montserrat" w:cs="Montserrat" w:eastAsia="Montserrat" w:hAnsi="Montserrat"/>
+                                  <w:b w:val="0"/>
+                                  <w:i w:val="0"/>
+                                  <w:smallCaps w:val="0"/>
+                                  <w:strike w:val="0"/>
+                                  <w:color w:val="000000"/>
+                                  <w:sz w:val="20"/>
+                                  <w:vertAlign w:val="baseline"/>
+                                </w:rPr>
+                                <w:t xml:space="preserve">del nostre punt de vista</w:t>
+                              </w:r>
+                            </w:p>
+                          </w:txbxContent>
+                        </wps:txbx>
+                        <wps:bodyPr anchorCtr="0" anchor="t" bIns="168125" lIns="168125" spcFirstLastPara="1" rIns="168125" wrap="square" tIns="168125">
+                          <a:noAutofit/>
+                        </wps:bodyPr>
+                      </wps:wsp>
+                      <wps:wsp>
+                        <wps:cNvSpPr txBox="1"/>
+                        <wps:cNvPr id="5" name="Shape 5"/>
+                        <wps:spPr>
+                          <a:xfrm>
+                            <a:off x="369301" y="3569050"/>
+                            <a:ext cx="2748000" cy="790500"/>
+                          </a:xfrm>
+                          <a:prstGeom prst="rect">
+                            <a:avLst/>
+                          </a:prstGeom>
+                          <a:noFill/>
+                          <a:ln>
+                            <a:noFill/>
+                          </a:ln>
+                        </wps:spPr>
+                        <wps:txbx>
+                          <w:txbxContent>
+                            <w:p>
+                              <w:pPr>
+                                <w:spacing w:after="0" w:before="0" w:line="240"/>
+                                <w:ind w:left="0" w:right="0" w:firstLine="0"/>
+                                <w:jc w:val="center"/>
+                                <w:textDirection w:val="btLr"/>
+                              </w:pPr>
+                              <w:r>
+                                <w:rPr>
+                                  <w:rFonts w:ascii="Montserrat" w:cs="Montserrat" w:eastAsia="Montserrat" w:hAnsi="Montserrat"/>
+                                  <w:b w:val="0"/>
+                                  <w:i w:val="0"/>
+                                  <w:smallCaps w:val="0"/>
+                                  <w:strike w:val="0"/>
+                                  <w:color w:val="000000"/>
+                                  <w:sz w:val="20"/>
+                                  <w:vertAlign w:val="baseline"/>
+                                </w:rPr>
+                                <w:t xml:space="preserve">Punts </w:t>
+                              </w:r>
+                              <w:r>
+                                <w:rPr>
+                                  <w:rFonts w:ascii="Montserrat" w:cs="Montserrat" w:eastAsia="Montserrat" w:hAnsi="Montserrat"/>
+                                  <w:b w:val="1"/>
+                                  <w:i w:val="0"/>
+                                  <w:smallCaps w:val="0"/>
+                                  <w:strike w:val="0"/>
+                                  <w:color w:val="980000"/>
+                                  <w:sz w:val="20"/>
+                                  <w:vertAlign w:val="baseline"/>
+                                </w:rPr>
+                                <w:t xml:space="preserve">a favor de l’altre </w:t>
+                              </w:r>
+                              <w:r>
+                                <w:rPr>
+                                  <w:rFonts w:ascii="Montserrat" w:cs="Montserrat" w:eastAsia="Montserrat" w:hAnsi="Montserrat"/>
+                                  <w:b w:val="0"/>
+                                  <w:i w:val="0"/>
+                                  <w:smallCaps w:val="0"/>
+                                  <w:strike w:val="0"/>
+                                  <w:color w:val="000000"/>
+                                  <w:sz w:val="20"/>
+                                  <w:vertAlign w:val="baseline"/>
+                                </w:rPr>
+                                <w:t xml:space="preserve">punt de vista</w:t>
+                              </w:r>
+                            </w:p>
+                          </w:txbxContent>
+                        </wps:txbx>
+                        <wps:bodyPr anchorCtr="0" anchor="t" bIns="168125" lIns="168125" spcFirstLastPara="1" rIns="168125" wrap="square" tIns="168125">
+                          <a:noAutofit/>
+                        </wps:bodyPr>
+                      </wps:wsp>
+                      <wps:wsp>
+                        <wps:cNvSpPr txBox="1"/>
+                        <wps:cNvPr id="6" name="Shape 6"/>
+                        <wps:spPr>
+                          <a:xfrm>
+                            <a:off x="3117649" y="3569050"/>
+                            <a:ext cx="2941800" cy="790500"/>
+                          </a:xfrm>
+                          <a:prstGeom prst="rect">
+                            <a:avLst/>
+                          </a:prstGeom>
+                          <a:noFill/>
+                          <a:ln>
+                            <a:noFill/>
+                          </a:ln>
+                        </wps:spPr>
+                        <wps:txbx>
+                          <w:txbxContent>
+                            <w:p>
+                              <w:pPr>
+                                <w:spacing w:after="0" w:before="0" w:line="240"/>
+                                <w:ind w:left="0" w:right="0" w:firstLine="0"/>
+                                <w:jc w:val="center"/>
+                                <w:textDirection w:val="btLr"/>
+                              </w:pPr>
+                              <w:r>
+                                <w:rPr>
+                                  <w:rFonts w:ascii="Montserrat" w:cs="Montserrat" w:eastAsia="Montserrat" w:hAnsi="Montserrat"/>
+                                  <w:b w:val="0"/>
+                                  <w:i w:val="0"/>
+                                  <w:smallCaps w:val="0"/>
+                                  <w:strike w:val="0"/>
+                                  <w:color w:val="000000"/>
+                                  <w:sz w:val="20"/>
+                                  <w:vertAlign w:val="baseline"/>
+                                </w:rPr>
+                                <w:t xml:space="preserve">Punts </w:t>
+                              </w:r>
+                              <w:r>
+                                <w:rPr>
+                                  <w:rFonts w:ascii="Montserrat" w:cs="Montserrat" w:eastAsia="Montserrat" w:hAnsi="Montserrat"/>
+                                  <w:b w:val="1"/>
+                                  <w:i w:val="0"/>
+                                  <w:smallCaps w:val="0"/>
+                                  <w:strike w:val="0"/>
+                                  <w:color w:val="38761d"/>
+                                  <w:sz w:val="20"/>
+                                  <w:vertAlign w:val="baseline"/>
+                                </w:rPr>
+                                <w:t xml:space="preserve">en contra de l’altre</w:t>
+                              </w:r>
+                              <w:r>
+                                <w:rPr>
+                                  <w:rFonts w:ascii="Montserrat" w:cs="Montserrat" w:eastAsia="Montserrat" w:hAnsi="Montserrat"/>
+                                  <w:b w:val="0"/>
+                                  <w:i w:val="0"/>
+                                  <w:smallCaps w:val="0"/>
+                                  <w:strike w:val="0"/>
+                                  <w:color w:val="000000"/>
+                                  <w:sz w:val="20"/>
+                                  <w:vertAlign w:val="baseline"/>
+                                </w:rPr>
+                                <w:t xml:space="preserve"> punt de vista</w:t>
+                              </w:r>
+                            </w:p>
+                          </w:txbxContent>
+                        </wps:txbx>
+                        <wps:bodyPr anchorCtr="0" anchor="t" bIns="168125" lIns="168125" spcFirstLastPara="1" rIns="168125" wrap="square" tIns="168125">
+                          <a:noAutofit/>
+                        </wps:bodyPr>
+                      </wps:wsp>
+                      <wps:wsp>
+                        <wps:cNvCnPr/>
+                        <wps:spPr>
+                          <a:xfrm flipH="1" rot="10800000">
+                            <a:off x="319175" y="3347025"/>
+                            <a:ext cx="5706600" cy="16800"/>
+                          </a:xfrm>
+                          <a:prstGeom prst="straightConnector1">
+                            <a:avLst/>
+                          </a:prstGeom>
+                          <a:noFill/>
+                          <a:ln cap="flat" cmpd="sng" w="19050">
+                            <a:solidFill>
+                              <a:srgbClr val="000000"/>
+                            </a:solidFill>
+                            <a:prstDash val="solid"/>
+                            <a:round/>
+                            <a:headEnd len="med" w="med" type="none"/>
+                            <a:tailEnd len="med" w="med" type="none"/>
+                          </a:ln>
+                        </wps:spPr>
+                        <wps:bodyPr anchorCtr="0" anchor="ctr" bIns="91425" lIns="91425" spcFirstLastPara="1" rIns="91425" wrap="square" tIns="91425">
+                          <a:noAutofit/>
+                        </wps:bodyPr>
+                      </wps:wsp>
+                    </wpg:wgp>
+                  </a:graphicData>
+                </a:graphic>
+              </wp:anchor>
+            </w:drawing>
+          </mc:Choice>
+          <mc:Fallback>
+            <w:drawing>
+              <wp:anchor allowOverlap="1" behindDoc="0" distB="114300" distT="114300" distL="114300" distR="114300" hidden="0" layoutInCell="1" locked="0" relativeHeight="0" simplePos="0">
+                <wp:simplePos x="0" y="0"/>
+                <wp:positionH relativeFrom="column">
+                  <wp:posOffset>114300</wp:posOffset>
+                </wp:positionH>
+                <wp:positionV relativeFrom="paragraph">
+                  <wp:posOffset>139700</wp:posOffset>
+                </wp:positionV>
+                <wp:extent cx="5157788" cy="4521437"/>
+                <wp:effectExtent b="0" l="0" r="0" t="0"/>
+                <wp:wrapSquare wrapText="bothSides" distB="114300" distT="114300" distL="114300" distR="114300"/>
+                <wp:docPr id="3" name="image3.png"/>
+                <a:graphic>
+                  <a:graphicData uri="http://schemas.openxmlformats.org/drawingml/2006/picture">
+                    <pic:pic>
+                      <pic:nvPicPr>
+                        <pic:cNvPr id="0" name="image3.png"/>
+                        <pic:cNvPicPr preferRelativeResize="0"/>
+                      </pic:nvPicPr>
+                      <pic:blipFill>
+                        <a:blip r:embed="rId6"/>
+                        <a:srcRect/>
+                        <a:stretch>
+                          <a:fillRect/>
+                        </a:stretch>
+                      </pic:blipFill>
+                      <pic:spPr>
+                        <a:xfrm>
+                          <a:off x="0" y="0"/>
+                          <a:ext cx="5157788" cy="4521437"/>
+                        </a:xfrm>
+                        <a:prstGeom prst="rect"/>
+                        <a:ln/>
+                      </pic:spPr>
+                    </pic:pic>
+                  </a:graphicData>
+                </a:graphic>
+              </wp:anchor>
+            </w:drawing>
+          </mc:Fallback>
+        </mc:AlternateContent>
+      </w:r>
+    </w:p>
+    <w:p>
+      <w:pPr>
+        <w:keepNext w:val="0"/>
+        <w:keepLines w:val="0"/>
+        <w:pageBreakBefore w:val="0"/>
+        <w:widowControl w:val="1"/>
+        <w:pBdr>
+          <w:top w:space="0" w:sz="0" w:val="nil"/>
+          <w:left w:space="0" w:sz="0" w:val="nil"/>
+          <w:bottom w:space="0" w:sz="0" w:val="nil"/>
+          <w:right w:space="0" w:sz="0" w:val="nil"/>
+          <w:between w:space="0" w:sz="0" w:val="nil"/>
+        </w:pBdr>
+        <w:shd w:fill="auto" w:val="clear"/>
+        <w:spacing w:after="0" w:before="40" w:line="240" w:lineRule="auto"/>
+        <w:ind w:right="0"/>
+        <w:jc w:val="left"/>
+        <w:rPr/>
+      </w:pPr>
+      <w:r>
+        <w:rPr>
+          <w:rtl w:val="0"/>
+        </w:rPr>
+      </w:r>
+    </w:p>
+    <w:p>
+      <w:pPr>
+        <w:keepNext w:val="0"/>
+        <w:keepLines w:val="0"/>
+        <w:pageBreakBefore w:val="0"/>
+        <w:widowControl w:val="1"/>
+        <w:pBdr>
+          <w:top w:space="0" w:sz="0" w:val="nil"/>
+          <w:left w:space="0" w:sz="0" w:val="nil"/>
+          <w:bottom w:space="0" w:sz="0" w:val="nil"/>
+          <w:right w:space="0" w:sz="0" w:val="nil"/>
+          <w:between w:space="0" w:sz="0" w:val="nil"/>
+        </w:pBdr>
+        <w:shd w:fill="auto" w:val="clear"/>
+        <w:spacing w:after="0" w:before="40" w:line="240" w:lineRule="auto"/>
+        <w:ind w:right="0"/>
+        <w:jc w:val="left"/>
+        <w:rPr/>
+      </w:pPr>
+      <w:r>
+        <w:rPr>
+          <w:rtl w:val="0"/>
+        </w:rPr>
+      </w:r>
+    </w:p>
+    <w:p>
+      <w:pPr>
+        <w:keepNext w:val="0"/>
+        <w:keepLines w:val="0"/>
+        <w:pageBreakBefore w:val="0"/>
+        <w:widowControl w:val="1"/>
+        <w:pBdr>
+          <w:top w:space="0" w:sz="0" w:val="nil"/>
+          <w:left w:space="0" w:sz="0" w:val="nil"/>
+          <w:bottom w:space="0" w:sz="0" w:val="nil"/>
+          <w:right w:space="0" w:sz="0" w:val="nil"/>
+          <w:between w:space="0" w:sz="0" w:val="nil"/>
+        </w:pBdr>
+        <w:shd w:fill="auto" w:val="clear"/>
+        <w:spacing w:after="0" w:before="40" w:line="240" w:lineRule="auto"/>
+        <w:ind w:right="0"/>
+        <w:jc w:val="left"/>
+        <w:rPr/>
+      </w:pPr>
+      <w:r>
+        <w:rPr>
+          <w:rtl w:val="0"/>
+        </w:rPr>
+      </w:r>
+    </w:p>
+    <w:p>
+      <w:pPr>
+        <w:keepNext w:val="0"/>
+        <w:keepLines w:val="0"/>
+        <w:pageBreakBefore w:val="0"/>
+        <w:widowControl w:val="1"/>
+        <w:pBdr>
+          <w:top w:space="0" w:sz="0" w:val="nil"/>
+          <w:left w:space="0" w:sz="0" w:val="nil"/>
+          <w:bottom w:space="0" w:sz="0" w:val="nil"/>
+          <w:right w:space="0" w:sz="0" w:val="nil"/>
+          <w:between w:space="0" w:sz="0" w:val="nil"/>
+        </w:pBdr>
+        <w:shd w:fill="auto" w:val="clear"/>
+        <w:spacing w:after="0" w:before="40" w:line="240" w:lineRule="auto"/>
+        <w:ind w:right="0"/>
+        <w:jc w:val="left"/>
+        <w:rPr/>
+      </w:pPr>
+      <w:r>
+        <w:rPr>
+          <w:rtl w:val="0"/>
+        </w:rPr>
+      </w:r>
+    </w:p>
+    <w:p>
+      <w:pPr>
+        <w:keepNext w:val="0"/>
+        <w:keepLines w:val="0"/>
+        <w:pageBreakBefore w:val="0"/>
+        <w:widowControl w:val="1"/>
+        <w:pBdr>
+          <w:top w:space="0" w:sz="0" w:val="nil"/>
+          <w:left w:space="0" w:sz="0" w:val="nil"/>
+          <w:bottom w:space="0" w:sz="0" w:val="nil"/>
+          <w:right w:space="0" w:sz="0" w:val="nil"/>
+          <w:between w:space="0" w:sz="0" w:val="nil"/>
+        </w:pBdr>
+        <w:shd w:fill="auto" w:val="clear"/>
+        <w:spacing w:after="0" w:before="40" w:line="240" w:lineRule="auto"/>
+        <w:ind w:right="0"/>
+        <w:jc w:val="left"/>
+        <w:rPr/>
+      </w:pPr>
+      <w:r>
+        <w:rPr>
+          <w:rtl w:val="0"/>
+        </w:rPr>
+      </w:r>
+    </w:p>
+    <w:p>
+      <w:pPr>
+        <w:keepNext w:val="0"/>
+        <w:keepLines w:val="0"/>
+        <w:pageBreakBefore w:val="0"/>
+        <w:widowControl w:val="1"/>
+        <w:pBdr>
+          <w:top w:space="0" w:sz="0" w:val="nil"/>
+          <w:left w:space="0" w:sz="0" w:val="nil"/>
+          <w:bottom w:space="0" w:sz="0" w:val="nil"/>
+          <w:right w:space="0" w:sz="0" w:val="nil"/>
+          <w:between w:space="0" w:sz="0" w:val="nil"/>
+        </w:pBdr>
+        <w:shd w:fill="auto" w:val="clear"/>
+        <w:spacing w:after="0" w:before="40" w:line="240" w:lineRule="auto"/>
+        <w:ind w:right="0"/>
+        <w:jc w:val="left"/>
+        <w:rPr/>
+      </w:pPr>
+      <w:r>
+        <w:rPr>
+          <w:rtl w:val="0"/>
+        </w:rPr>
+      </w:r>
+    </w:p>
+    <w:p>
+      <w:pPr>
+        <w:keepNext w:val="0"/>
+        <w:keepLines w:val="0"/>
+        <w:pageBreakBefore w:val="0"/>
+        <w:widowControl w:val="1"/>
+        <w:pBdr>
+          <w:top w:space="0" w:sz="0" w:val="nil"/>
+          <w:left w:space="0" w:sz="0" w:val="nil"/>
+          <w:bottom w:space="0" w:sz="0" w:val="nil"/>
+          <w:right w:space="0" w:sz="0" w:val="nil"/>
+          <w:between w:space="0" w:sz="0" w:val="nil"/>
+        </w:pBdr>
+        <w:shd w:fill="auto" w:val="clear"/>
+        <w:spacing w:after="0" w:before="40" w:line="240" w:lineRule="auto"/>
+        <w:ind w:right="0"/>
+        <w:jc w:val="left"/>
+        <w:rPr/>
+      </w:pPr>
+      <w:r>
+        <w:rPr>
+          <w:rtl w:val="0"/>
+        </w:rPr>
+      </w:r>
+    </w:p>
+    <w:p>
+      <w:pPr>
+        <w:keepNext w:val="0"/>
+        <w:keepLines w:val="0"/>
+        <w:pageBreakBefore w:val="0"/>
+        <w:widowControl w:val="1"/>
+        <w:pBdr>
+          <w:top w:space="0" w:sz="0" w:val="nil"/>
+          <w:left w:space="0" w:sz="0" w:val="nil"/>
+          <w:bottom w:space="0" w:sz="0" w:val="nil"/>
+          <w:right w:space="0" w:sz="0" w:val="nil"/>
+          <w:between w:space="0" w:sz="0" w:val="nil"/>
+        </w:pBdr>
+        <w:shd w:fill="auto" w:val="clear"/>
+        <w:spacing w:after="0" w:before="40" w:line="240" w:lineRule="auto"/>
+        <w:ind w:right="0"/>
+        <w:jc w:val="left"/>
+        <w:rPr/>
+      </w:pPr>
+      <w:r>
+        <w:rPr>
+          <w:rtl w:val="0"/>
+        </w:rPr>
+      </w:r>
+    </w:p>
+    <w:p>
+      <w:pPr>
+        <w:keepNext w:val="0"/>
+        <w:keepLines w:val="0"/>
+        <w:pageBreakBefore w:val="0"/>
+        <w:widowControl w:val="1"/>
+        <w:pBdr>
+          <w:top w:space="0" w:sz="0" w:val="nil"/>
+          <w:left w:space="0" w:sz="0" w:val="nil"/>
+          <w:bottom w:space="0" w:sz="0" w:val="nil"/>
+          <w:right w:space="0" w:sz="0" w:val="nil"/>
+          <w:between w:space="0" w:sz="0" w:val="nil"/>
+        </w:pBdr>
+        <w:shd w:fill="auto" w:val="clear"/>
+        <w:spacing w:after="0" w:before="40" w:line="240" w:lineRule="auto"/>
+        <w:ind w:right="0"/>
+        <w:jc w:val="left"/>
+        <w:rPr/>
+      </w:pPr>
+      <w:r>
+        <w:rPr>
+          <w:rtl w:val="0"/>
+        </w:rPr>
+      </w:r>
+    </w:p>
+    <w:p>
+      <w:pPr>
+        <w:keepNext w:val="0"/>
+        <w:keepLines w:val="0"/>
+        <w:pageBreakBefore w:val="0"/>
+        <w:widowControl w:val="1"/>
+        <w:pBdr>
+          <w:top w:space="0" w:sz="0" w:val="nil"/>
+          <w:left w:space="0" w:sz="0" w:val="nil"/>
+          <w:bottom w:space="0" w:sz="0" w:val="nil"/>
+          <w:right w:space="0" w:sz="0" w:val="nil"/>
+          <w:between w:space="0" w:sz="0" w:val="nil"/>
+        </w:pBdr>
+        <w:shd w:fill="auto" w:val="clear"/>
+        <w:spacing w:after="0" w:before="40" w:line="240" w:lineRule="auto"/>
+        <w:ind w:right="0"/>
+        <w:jc w:val="left"/>
+        <w:rPr/>
+      </w:pPr>
+      <w:r>
+        <w:rPr>
+          <w:rtl w:val="0"/>
+        </w:rPr>
+      </w:r>
+    </w:p>
+    <w:p>
+      <w:pPr>
+        <w:keepNext w:val="0"/>
+        <w:keepLines w:val="0"/>
+        <w:pageBreakBefore w:val="0"/>
+        <w:widowControl w:val="1"/>
+        <w:pBdr>
+          <w:top w:space="0" w:sz="0" w:val="nil"/>
+          <w:left w:space="0" w:sz="0" w:val="nil"/>
+          <w:bottom w:space="0" w:sz="0" w:val="nil"/>
+          <w:right w:space="0" w:sz="0" w:val="nil"/>
+          <w:between w:space="0" w:sz="0" w:val="nil"/>
+        </w:pBdr>
+        <w:shd w:fill="auto" w:val="clear"/>
+        <w:spacing w:after="0" w:before="40" w:line="240" w:lineRule="auto"/>
+        <w:ind w:right="0"/>
+        <w:jc w:val="left"/>
+        <w:rPr/>
+      </w:pPr>
+      <w:r>
+        <w:rPr>
+          <w:rtl w:val="0"/>
+        </w:rPr>
+      </w:r>
+    </w:p>
+    <w:p>
+      <w:pPr>
+        <w:keepNext w:val="0"/>
+        <w:keepLines w:val="0"/>
+        <w:pageBreakBefore w:val="0"/>
+        <w:widowControl w:val="1"/>
+        <w:pBdr>
+          <w:top w:space="0" w:sz="0" w:val="nil"/>
+          <w:left w:space="0" w:sz="0" w:val="nil"/>
+          <w:bottom w:space="0" w:sz="0" w:val="nil"/>
+          <w:right w:space="0" w:sz="0" w:val="nil"/>
+          <w:between w:space="0" w:sz="0" w:val="nil"/>
+        </w:pBdr>
+        <w:shd w:fill="auto" w:val="clear"/>
+        <w:spacing w:after="0" w:before="40" w:line="240" w:lineRule="auto"/>
+        <w:ind w:right="0"/>
+        <w:jc w:val="left"/>
+        <w:rPr/>
+      </w:pPr>
+      <w:r>
+        <w:rPr>
+          <w:rtl w:val="0"/>
+        </w:rPr>
+      </w:r>
+    </w:p>
+    <w:p>
+      <w:pPr>
+        <w:keepNext w:val="0"/>
+        <w:keepLines w:val="0"/>
+        <w:pageBreakBefore w:val="0"/>
+        <w:widowControl w:val="1"/>
+        <w:pBdr>
+          <w:top w:space="0" w:sz="0" w:val="nil"/>
+          <w:left w:space="0" w:sz="0" w:val="nil"/>
+          <w:bottom w:space="0" w:sz="0" w:val="nil"/>
+          <w:right w:space="0" w:sz="0" w:val="nil"/>
+          <w:between w:space="0" w:sz="0" w:val="nil"/>
+        </w:pBdr>
+        <w:shd w:fill="auto" w:val="clear"/>
+        <w:spacing w:after="0" w:before="40" w:line="240" w:lineRule="auto"/>
+        <w:ind w:right="0"/>
+        <w:jc w:val="left"/>
+        <w:rPr/>
+      </w:pPr>
+      <w:r>
+        <w:rPr>
+          <w:rtl w:val="0"/>
+        </w:rPr>
+      </w:r>
+    </w:p>
+    <w:p>
+      <w:pPr>
+        <w:keepNext w:val="0"/>
+        <w:keepLines w:val="0"/>
+        <w:pageBreakBefore w:val="0"/>
+        <w:widowControl w:val="1"/>
+        <w:pBdr>
+          <w:top w:space="0" w:sz="0" w:val="nil"/>
+          <w:left w:space="0" w:sz="0" w:val="nil"/>
+          <w:bottom w:space="0" w:sz="0" w:val="nil"/>
+          <w:right w:space="0" w:sz="0" w:val="nil"/>
+          <w:between w:space="0" w:sz="0" w:val="nil"/>
+        </w:pBdr>
+        <w:shd w:fill="auto" w:val="clear"/>
+        <w:spacing w:after="0" w:before="40" w:line="240" w:lineRule="auto"/>
+        <w:ind w:right="0"/>
+        <w:jc w:val="left"/>
+        <w:rPr/>
+      </w:pPr>
+      <w:r>
+        <w:rPr>
+          <w:rtl w:val="0"/>
+        </w:rPr>
+      </w:r>
+    </w:p>
+    <w:p>
+      <w:pPr>
+        <w:keepNext w:val="0"/>
+        <w:keepLines w:val="0"/>
+        <w:pageBreakBefore w:val="0"/>
+        <w:widowControl w:val="1"/>
+        <w:pBdr>
+          <w:top w:space="0" w:sz="0" w:val="nil"/>
+          <w:left w:space="0" w:sz="0" w:val="nil"/>
+          <w:bottom w:space="0" w:sz="0" w:val="nil"/>
+          <w:right w:space="0" w:sz="0" w:val="nil"/>
+          <w:between w:space="0" w:sz="0" w:val="nil"/>
+        </w:pBdr>
+        <w:shd w:fill="auto" w:val="clear"/>
+        <w:spacing w:after="0" w:before="40" w:line="240" w:lineRule="auto"/>
+        <w:ind w:right="0"/>
+        <w:jc w:val="left"/>
+        <w:rPr/>
+      </w:pPr>
+      <w:r>
+        <w:rPr>
+          <w:rtl w:val="0"/>
+        </w:rPr>
+      </w:r>
+    </w:p>
+    <w:p>
+      <w:pPr>
+        <w:keepNext w:val="0"/>
+        <w:keepLines w:val="0"/>
+        <w:pageBreakBefore w:val="0"/>
+        <w:widowControl w:val="1"/>
+        <w:pBdr>
+          <w:top w:space="0" w:sz="0" w:val="nil"/>
+          <w:left w:space="0" w:sz="0" w:val="nil"/>
+          <w:bottom w:space="0" w:sz="0" w:val="nil"/>
+          <w:right w:space="0" w:sz="0" w:val="nil"/>
+          <w:between w:space="0" w:sz="0" w:val="nil"/>
+        </w:pBdr>
+        <w:shd w:fill="auto" w:val="clear"/>
+        <w:spacing w:after="0" w:before="40" w:line="240" w:lineRule="auto"/>
+        <w:ind w:right="0"/>
+        <w:jc w:val="left"/>
+        <w:rPr/>
+      </w:pPr>
+      <w:r>
+        <w:rPr>
+          <w:rtl w:val="0"/>
+        </w:rPr>
+      </w:r>
+    </w:p>
+    <w:p>
+      <w:pPr>
+        <w:keepNext w:val="0"/>
+        <w:keepLines w:val="0"/>
+        <w:pageBreakBefore w:val="0"/>
+        <w:widowControl w:val="1"/>
+        <w:pBdr>
+          <w:top w:space="0" w:sz="0" w:val="nil"/>
+          <w:left w:space="0" w:sz="0" w:val="nil"/>
+          <w:bottom w:space="0" w:sz="0" w:val="nil"/>
+          <w:right w:space="0" w:sz="0" w:val="nil"/>
+          <w:between w:space="0" w:sz="0" w:val="nil"/>
+        </w:pBdr>
+        <w:shd w:fill="auto" w:val="clear"/>
+        <w:spacing w:after="0" w:before="40" w:line="240" w:lineRule="auto"/>
+        <w:ind w:right="0"/>
+        <w:jc w:val="left"/>
+        <w:rPr/>
+      </w:pPr>
+      <w:r>
+        <w:rPr>
+          <w:rtl w:val="0"/>
+        </w:rPr>
+      </w:r>
+    </w:p>
+    <w:p>
+      <w:pPr>
+        <w:keepNext w:val="0"/>
+        <w:keepLines w:val="0"/>
+        <w:pageBreakBefore w:val="0"/>
+        <w:widowControl w:val="1"/>
+        <w:pBdr>
+          <w:top w:space="0" w:sz="0" w:val="nil"/>
+          <w:left w:space="0" w:sz="0" w:val="nil"/>
+          <w:bottom w:space="0" w:sz="0" w:val="nil"/>
+          <w:right w:space="0" w:sz="0" w:val="nil"/>
+          <w:between w:space="0" w:sz="0" w:val="nil"/>
+        </w:pBdr>
+        <w:shd w:fill="auto" w:val="clear"/>
+        <w:spacing w:after="0" w:before="40" w:line="240" w:lineRule="auto"/>
+        <w:ind w:right="0"/>
+        <w:jc w:val="left"/>
+        <w:rPr/>
+      </w:pPr>
+      <w:r>
+        <w:rPr>
+          <w:rtl w:val="0"/>
+        </w:rPr>
+      </w:r>
+    </w:p>
+    <w:p>
+      <w:pPr>
+        <w:keepNext w:val="0"/>
+        <w:keepLines w:val="0"/>
+        <w:pageBreakBefore w:val="0"/>
+        <w:widowControl w:val="1"/>
+        <w:pBdr>
+          <w:top w:space="0" w:sz="0" w:val="nil"/>
+          <w:left w:space="0" w:sz="0" w:val="nil"/>
+          <w:bottom w:space="0" w:sz="0" w:val="nil"/>
+          <w:right w:space="0" w:sz="0" w:val="nil"/>
+          <w:between w:space="0" w:sz="0" w:val="nil"/>
+        </w:pBdr>
+        <w:shd w:fill="auto" w:val="clear"/>
+        <w:spacing w:after="0" w:before="40" w:line="240" w:lineRule="auto"/>
+        <w:ind w:right="0"/>
+        <w:jc w:val="left"/>
+        <w:rPr/>
+      </w:pPr>
+      <w:r>
+        <w:rPr>
+          <w:rtl w:val="0"/>
+        </w:rPr>
+      </w:r>
+    </w:p>
+    <w:p>
+      <w:pPr>
+        <w:keepNext w:val="0"/>
+        <w:keepLines w:val="0"/>
+        <w:pageBreakBefore w:val="0"/>
+        <w:widowControl w:val="1"/>
+        <w:pBdr>
+          <w:top w:space="0" w:sz="0" w:val="nil"/>
+          <w:left w:space="0" w:sz="0" w:val="nil"/>
+          <w:bottom w:space="0" w:sz="0" w:val="nil"/>
+          <w:right w:space="0" w:sz="0" w:val="nil"/>
+          <w:between w:space="0" w:sz="0" w:val="nil"/>
+        </w:pBdr>
+        <w:shd w:fill="auto" w:val="clear"/>
+        <w:spacing w:after="0" w:before="40" w:line="240" w:lineRule="auto"/>
+        <w:ind w:right="0"/>
+        <w:jc w:val="left"/>
+        <w:rPr/>
+      </w:pPr>
+      <w:r>
+        <w:rPr>
+          <w:rtl w:val="0"/>
+        </w:rPr>
+      </w:r>
+    </w:p>
+    <w:p>
+      <w:pPr>
+        <w:keepNext w:val="0"/>
+        <w:keepLines w:val="0"/>
+        <w:pageBreakBefore w:val="0"/>
+        <w:widowControl w:val="1"/>
+        <w:pBdr>
+          <w:top w:space="0" w:sz="0" w:val="nil"/>
+          <w:left w:space="0" w:sz="0" w:val="nil"/>
+          <w:bottom w:space="0" w:sz="0" w:val="nil"/>
+          <w:right w:space="0" w:sz="0" w:val="nil"/>
+          <w:between w:space="0" w:sz="0" w:val="nil"/>
+        </w:pBdr>
+        <w:shd w:fill="auto" w:val="clear"/>
+        <w:spacing w:after="0" w:before="40" w:line="240" w:lineRule="auto"/>
+        <w:ind w:right="0"/>
+        <w:jc w:val="left"/>
+        <w:rPr/>
+      </w:pPr>
+      <w:r>
+        <w:rPr>
+          <w:rtl w:val="0"/>
+        </w:rPr>
+      </w:r>
+    </w:p>
+    <w:p>
+      <w:pPr>
+        <w:keepNext w:val="0"/>
+        <w:keepLines w:val="0"/>
+        <w:pageBreakBefore w:val="0"/>
+        <w:widowControl w:val="1"/>
+        <w:pBdr>
+          <w:top w:space="0" w:sz="0" w:val="nil"/>
+          <w:left w:space="0" w:sz="0" w:val="nil"/>
+          <w:bottom w:space="0" w:sz="0" w:val="nil"/>
+          <w:right w:space="0" w:sz="0" w:val="nil"/>
+          <w:between w:space="0" w:sz="0" w:val="nil"/>
+        </w:pBdr>
+        <w:shd w:fill="auto" w:val="clear"/>
+        <w:spacing w:after="0" w:before="40" w:line="240" w:lineRule="auto"/>
+        <w:ind w:right="0"/>
+        <w:jc w:val="left"/>
+        <w:rPr/>
+      </w:pPr>
+      <w:r>
+        <w:rPr>
+          <w:rtl w:val="0"/>
+        </w:rPr>
+      </w:r>
+    </w:p>
+    <w:p>
+      <w:pPr>
+        <w:keepNext w:val="0"/>
+        <w:keepLines w:val="0"/>
+        <w:pageBreakBefore w:val="0"/>
+        <w:widowControl w:val="1"/>
+        <w:pBdr>
+          <w:top w:space="0" w:sz="0" w:val="nil"/>
+          <w:left w:space="0" w:sz="0" w:val="nil"/>
+          <w:bottom w:space="0" w:sz="0" w:val="nil"/>
+          <w:right w:space="0" w:sz="0" w:val="nil"/>
+          <w:between w:space="0" w:sz="0" w:val="nil"/>
+        </w:pBdr>
+        <w:shd w:fill="auto" w:val="clear"/>
+        <w:spacing w:after="0" w:before="40" w:line="240" w:lineRule="auto"/>
+        <w:ind w:right="0"/>
+        <w:jc w:val="left"/>
+        <w:rPr/>
+      </w:pPr>
+      <w:r>
+        <w:rPr>
+          <w:rtl w:val="0"/>
+        </w:rPr>
+      </w:r>
+    </w:p>
+    <w:p>
+      <w:pPr>
+        <w:keepNext w:val="0"/>
+        <w:keepLines w:val="0"/>
+        <w:pageBreakBefore w:val="0"/>
+        <w:widowControl w:val="1"/>
+        <w:pBdr>
+          <w:top w:space="0" w:sz="0" w:val="nil"/>
+          <w:left w:space="0" w:sz="0" w:val="nil"/>
+          <w:bottom w:space="0" w:sz="0" w:val="nil"/>
+          <w:right w:space="0" w:sz="0" w:val="nil"/>
+          <w:between w:space="0" w:sz="0" w:val="nil"/>
+        </w:pBdr>
+        <w:shd w:fill="auto" w:val="clear"/>
+        <w:spacing w:after="0" w:before="40" w:line="240" w:lineRule="auto"/>
+        <w:ind w:right="0"/>
+        <w:jc w:val="left"/>
+        <w:rPr/>
+      </w:pPr>
+      <w:r>
+        <w:rPr>
+          <w:rtl w:val="0"/>
+        </w:rPr>
+      </w:r>
+    </w:p>
+    <w:p>
+      <w:pPr>
+        <w:pStyle w:val="Heading3"/>
+        <w:keepNext w:val="0"/>
+        <w:keepLines w:val="0"/>
+        <w:spacing w:before="280" w:line="240" w:lineRule="auto"/>
+        <w:jc w:val="left"/>
+        <w:rPr>
+          <w:color w:val="000000"/>
+          <w:sz w:val="26"/>
+          <w:szCs w:val="26"/>
+        </w:rPr>
+      </w:pPr>
+      <w:bookmarkStart w:colFirst="0" w:colLast="0" w:name="_96owr5gg606l" w:id="28"/>
+      <w:bookmarkEnd w:id="28"/>
       <w:r>
         <w:rPr>
           <w:rtl w:val="0"/>
@@ -10244,11 +11643,19 @@
       </w:pPr>
     </w:pPrDefault>
   </w:docDefaults>
+  <w:style w:type="table" w:styleId="TableNormal" w:default="1">
+    <w:name w:val="TableNormal"/>
+    <w:tblPr>
+      <w:tblCellMar>
+        <w:top w:w="100.0" w:type="dxa"/>
+        <w:left w:w="100.0" w:type="dxa"/>
+        <w:bottom w:w="100.0" w:type="dxa"/>
+        <w:right w:w="100.0" w:type="dxa"/>
+      </w:tblCellMar>
+    </w:tblPr>
+  </w:style>
   <w:style w:type="paragraph" w:styleId="Normal" w:default="1">
     <w:name w:val="normal"/>
-  </w:style>
-  <w:style w:type="table" w:styleId="TableNormal" w:default="1">
-    <w:name w:val="TableNormal"/>
   </w:style>
   <w:style w:type="paragraph" w:styleId="Heading1">
     <w:name w:val="heading 1"/>
@@ -10385,12 +11792,7 @@
     <w:tblPr>
       <w:tblStyleRowBandSize w:val="1"/>
       <w:tblStyleColBandSize w:val="1"/>
-      <w:tblCellMar>
-        <w:top w:w="100.0" w:type="dxa"/>
-        <w:left w:w="100.0" w:type="dxa"/>
-        <w:bottom w:w="100.0" w:type="dxa"/>
-        <w:right w:w="100.0" w:type="dxa"/>
-      </w:tblCellMar>
+      <w:tblCellMar/>
     </w:tblPr>
   </w:style>
 </w:styles>

</xml_diff>